<commit_message>
uv november, res. gospel insertion
</commit_message>
<xml_diff>
--- a/flow/20230914_vu_template/01-Октоїх/Глас_1/1-НД.docx
+++ b/flow/20230914_vu_template/01-Октоїх/Глас_1/1-НД.docx
@@ -291,15 +291,18 @@
     </w:p>
     <w:p>
       <w:pPr>
-        <w:pStyle w:val="Normal"/>
-        <w:spacing w:after="120"/>
-      </w:pPr>
-      <w:r>
-        <w:rPr>
-          <w:rFonts w:ascii="Times New Roman" w:hAnsi="Times New Roman"/>
-          <w:i/>
-          <w:color w:val="FF0000"/>
-          <w:sz w:val="24"/>
+        <w:spacing w:after="120"/>
+        <w:rPr>
+          <w:lang w:val="ru-MD"/>
+        </w:rPr>
+      </w:pPr>
+      <w:r>
+        <w:rPr>
+          <w:rFonts w:ascii="Times New Roman" w:hAnsi="Times New Roman"/>
+          <w:i/>
+          <w:color w:val="FF0000"/>
+          <w:sz w:val="24"/>
+          <w:lang w:val="ru-MD"/>
         </w:rPr>
         <w:t>Вірні:</w:t>
       </w:r>
@@ -308,6 +311,7 @@
           <w:rFonts w:ascii="Times New Roman" w:hAnsi="Times New Roman"/>
           <w:color w:val="FF0000"/>
           <w:sz w:val="24"/>
+          <w:lang w:val="ru-MD"/>
         </w:rPr>
         <w:t xml:space="preserve"> </w:t>
       </w:r>
@@ -315,6 +319,7 @@
         <w:rPr>
           <w:rFonts w:ascii="Times New Roman" w:hAnsi="Times New Roman"/>
           <w:sz w:val="24"/>
+          <w:lang w:val="ru-MD"/>
         </w:rPr>
         <w:t xml:space="preserve">Амі́нь. Го́споди, поми́луй. </w:t>
       </w:r>
@@ -324,35 +329,25 @@
           <w:i/>
           <w:color w:val="FF0000"/>
           <w:sz w:val="24"/>
+          <w:lang w:val="ru-MD"/>
         </w:rPr>
         <w:t>(12 р.)</w:t>
       </w:r>
     </w:p>
     <w:p>
       <w:pPr>
-        <w:pStyle w:val="Normal"/>
-        <w:spacing w:after="120"/>
-      </w:pPr>
-      <w:r>
-        <w:rPr>
-          <w:rFonts w:ascii="Times New Roman" w:hAnsi="Times New Roman"/>
-          <w:sz w:val="24"/>
-        </w:rPr>
-        <w:t>Сла́ва Отцю́, і Си́ну, і Свято́му Ду́хові,</w:t>
-      </w:r>
-      <w:r>
-        <w:rPr>
-          <w:rFonts w:ascii="Times New Roman" w:hAnsi="Times New Roman"/>
-          <w:sz w:val="24"/>
-        </w:rPr>
-        <w:t>*</w:t>
-      </w:r>
-      <w:r>
-        <w:rPr>
-          <w:rFonts w:ascii="Times New Roman" w:hAnsi="Times New Roman"/>
-          <w:sz w:val="24"/>
-        </w:rPr>
-        <w:t xml:space="preserve"> і ни́ні, і повсякча́с, і на ві́ки вікі́в. Амі́нь.</w:t>
+        <w:spacing w:after="120"/>
+        <w:rPr>
+          <w:lang w:val="ru-MD"/>
+        </w:rPr>
+      </w:pPr>
+      <w:r>
+        <w:rPr>
+          <w:rFonts w:ascii="Times New Roman" w:hAnsi="Times New Roman"/>
+          <w:sz w:val="24"/>
+          <w:lang w:val="ru-MD"/>
+        </w:rPr>
+        <w:t>Сла́ва Отцю́, і Си́ну, і Свято́му Ду́хові,* і ни́ні, і повсякча́с, і на ві́ки вікі́в. Амі́нь.</w:t>
       </w:r>
     </w:p>
     <w:p>
@@ -509,11 +504,15 @@
     <w:p>
       <w:pPr>
         <w:spacing w:after="120"/>
-      </w:pPr>
-      <w:r>
-        <w:rPr>
-          <w:rFonts w:ascii="Times New Roman" w:hAnsi="Times New Roman"/>
-          <w:sz w:val="24"/>
+        <w:rPr>
+          <w:lang w:val="ru-MD"/>
+        </w:rPr>
+      </w:pPr>
+      <w:r>
+        <w:rPr>
+          <w:rFonts w:ascii="Times New Roman" w:hAnsi="Times New Roman"/>
+          <w:sz w:val="24"/>
+          <w:lang w:val="ru-MD"/>
         </w:rPr>
         <w:t>Вітри́ Свої́ми посланця́ми учиня́єш,* по́лум’я вогне́нне − слу́гами Свої́ми.</w:t>
       </w:r>
@@ -521,11 +520,15 @@
     <w:p>
       <w:pPr>
         <w:spacing w:after="120"/>
-      </w:pPr>
-      <w:r>
-        <w:rPr>
-          <w:rFonts w:ascii="Times New Roman" w:hAnsi="Times New Roman"/>
-          <w:sz w:val="24"/>
+        <w:rPr>
+          <w:lang w:val="ru-MD"/>
+        </w:rPr>
+      </w:pPr>
+      <w:r>
+        <w:rPr>
+          <w:rFonts w:ascii="Times New Roman" w:hAnsi="Times New Roman"/>
+          <w:sz w:val="24"/>
+          <w:lang w:val="ru-MD"/>
         </w:rPr>
         <w:t>Ти заснува́в зе́млю на її́ підва́линах,* не захита́ється по ві́ки вікі́в.</w:t>
       </w:r>
@@ -533,11 +536,15 @@
     <w:p>
       <w:pPr>
         <w:spacing w:after="120"/>
-      </w:pPr>
-      <w:r>
-        <w:rPr>
-          <w:rFonts w:ascii="Times New Roman" w:hAnsi="Times New Roman"/>
-          <w:sz w:val="24"/>
+        <w:rPr>
+          <w:lang w:val="ru-MD"/>
+        </w:rPr>
+      </w:pPr>
+      <w:r>
+        <w:rPr>
+          <w:rFonts w:ascii="Times New Roman" w:hAnsi="Times New Roman"/>
+          <w:sz w:val="24"/>
+          <w:lang w:val="ru-MD"/>
         </w:rPr>
         <w:t>Безо́днею, немо́в оде́жею, покри́в її́,* по́над го́рами ста́ли во́ди.</w:t>
       </w:r>
@@ -545,11 +552,15 @@
     <w:p>
       <w:pPr>
         <w:spacing w:after="120"/>
-      </w:pPr>
-      <w:r>
-        <w:rPr>
-          <w:rFonts w:ascii="Times New Roman" w:hAnsi="Times New Roman"/>
-          <w:sz w:val="24"/>
+        <w:rPr>
+          <w:lang w:val="ru-MD"/>
+        </w:rPr>
+      </w:pPr>
+      <w:r>
+        <w:rPr>
+          <w:rFonts w:ascii="Times New Roman" w:hAnsi="Times New Roman"/>
+          <w:sz w:val="24"/>
+          <w:lang w:val="ru-MD"/>
         </w:rPr>
         <w:t>Пе́ред погро́зою Твоє́ю вони́ тіка́ли,* пе́ред го́лосом гро́му Твого́ тремті́ли.</w:t>
       </w:r>
@@ -558,119 +569,1556 @@
       <w:pPr>
         <w:spacing w:after="120"/>
       </w:pPr>
-      <w:r>
-        <w:rPr>
-          <w:rFonts w:ascii="Times New Roman" w:hAnsi="Times New Roman"/>
-          <w:sz w:val="24"/>
-        </w:rPr>
-        <w:t>Підвели́ся го́ри, зійшли́ доли́ни до мі́сця,* що Ти їм призна́чив.</w:t>
-      </w:r>
-    </w:p>
-    <w:p>
-      <w:pPr>
-        <w:spacing w:after="120"/>
-      </w:pPr>
-      <w:r>
-        <w:rPr>
-          <w:rFonts w:ascii="Times New Roman" w:hAnsi="Times New Roman"/>
-          <w:sz w:val="24"/>
-        </w:rPr>
-        <w:t>Поста́вив їм грани́цю, яко́ї не пере́йдуть,* щоб зно́ву покри́ти зе́млю.</w:t>
-      </w:r>
-    </w:p>
-    <w:p>
-      <w:pPr>
-        <w:spacing w:after="120"/>
-      </w:pPr>
-      <w:r>
-        <w:rPr>
-          <w:rFonts w:ascii="Times New Roman" w:hAnsi="Times New Roman"/>
-          <w:sz w:val="24"/>
-        </w:rPr>
-        <w:t>Джере́ла посила́єш у рі́ки,* які́ течу́ть по́між го́рами.</w:t>
-      </w:r>
-    </w:p>
-    <w:p>
-      <w:pPr>
-        <w:spacing w:after="120"/>
-      </w:pPr>
+      <w:proofErr w:type="spellStart"/>
+      <w:r>
+        <w:rPr>
+          <w:rFonts w:ascii="Times New Roman" w:hAnsi="Times New Roman"/>
+          <w:sz w:val="24"/>
+        </w:rPr>
+        <w:t>Підвели́ся</w:t>
+      </w:r>
+      <w:proofErr w:type="spellEnd"/>
+      <w:r>
+        <w:rPr>
+          <w:rFonts w:ascii="Times New Roman" w:hAnsi="Times New Roman"/>
+          <w:sz w:val="24"/>
+        </w:rPr>
+        <w:t xml:space="preserve"> </w:t>
+      </w:r>
+      <w:proofErr w:type="spellStart"/>
+      <w:r>
+        <w:rPr>
+          <w:rFonts w:ascii="Times New Roman" w:hAnsi="Times New Roman"/>
+          <w:sz w:val="24"/>
+        </w:rPr>
+        <w:t>го́ри</w:t>
+      </w:r>
+      <w:proofErr w:type="spellEnd"/>
+      <w:r>
+        <w:rPr>
+          <w:rFonts w:ascii="Times New Roman" w:hAnsi="Times New Roman"/>
+          <w:sz w:val="24"/>
+        </w:rPr>
+        <w:t xml:space="preserve">, </w:t>
+      </w:r>
+      <w:proofErr w:type="spellStart"/>
+      <w:r>
+        <w:rPr>
+          <w:rFonts w:ascii="Times New Roman" w:hAnsi="Times New Roman"/>
+          <w:sz w:val="24"/>
+        </w:rPr>
+        <w:t>зійшли</w:t>
+      </w:r>
+      <w:proofErr w:type="spellEnd"/>
+      <w:r>
+        <w:rPr>
+          <w:rFonts w:ascii="Times New Roman" w:hAnsi="Times New Roman"/>
+          <w:sz w:val="24"/>
+        </w:rPr>
+        <w:t xml:space="preserve">́ </w:t>
+      </w:r>
+      <w:proofErr w:type="spellStart"/>
+      <w:r>
+        <w:rPr>
+          <w:rFonts w:ascii="Times New Roman" w:hAnsi="Times New Roman"/>
+          <w:sz w:val="24"/>
+        </w:rPr>
+        <w:t>доли́ни</w:t>
+      </w:r>
+      <w:proofErr w:type="spellEnd"/>
+      <w:r>
+        <w:rPr>
+          <w:rFonts w:ascii="Times New Roman" w:hAnsi="Times New Roman"/>
+          <w:sz w:val="24"/>
+        </w:rPr>
+        <w:t xml:space="preserve"> </w:t>
+      </w:r>
+      <w:proofErr w:type="spellStart"/>
+      <w:r>
+        <w:rPr>
+          <w:rFonts w:ascii="Times New Roman" w:hAnsi="Times New Roman"/>
+          <w:sz w:val="24"/>
+        </w:rPr>
+        <w:t>до</w:t>
+      </w:r>
+      <w:proofErr w:type="spellEnd"/>
+      <w:r>
+        <w:rPr>
+          <w:rFonts w:ascii="Times New Roman" w:hAnsi="Times New Roman"/>
+          <w:sz w:val="24"/>
+        </w:rPr>
+        <w:t xml:space="preserve"> </w:t>
+      </w:r>
+      <w:proofErr w:type="spellStart"/>
+      <w:proofErr w:type="gramStart"/>
+      <w:r>
+        <w:rPr>
+          <w:rFonts w:ascii="Times New Roman" w:hAnsi="Times New Roman"/>
+          <w:sz w:val="24"/>
+        </w:rPr>
+        <w:t>мі́сця</w:t>
+      </w:r>
+      <w:proofErr w:type="spellEnd"/>
+      <w:r>
+        <w:rPr>
+          <w:rFonts w:ascii="Times New Roman" w:hAnsi="Times New Roman"/>
+          <w:sz w:val="24"/>
+        </w:rPr>
+        <w:t>,*</w:t>
+      </w:r>
+      <w:proofErr w:type="gramEnd"/>
+      <w:r>
+        <w:rPr>
+          <w:rFonts w:ascii="Times New Roman" w:hAnsi="Times New Roman"/>
+          <w:sz w:val="24"/>
+        </w:rPr>
+        <w:t xml:space="preserve"> що Ти </w:t>
+      </w:r>
+      <w:proofErr w:type="spellStart"/>
+      <w:r>
+        <w:rPr>
+          <w:rFonts w:ascii="Times New Roman" w:hAnsi="Times New Roman"/>
+          <w:sz w:val="24"/>
+        </w:rPr>
+        <w:t>їм</w:t>
+      </w:r>
+      <w:proofErr w:type="spellEnd"/>
+      <w:r>
+        <w:rPr>
+          <w:rFonts w:ascii="Times New Roman" w:hAnsi="Times New Roman"/>
+          <w:sz w:val="24"/>
+        </w:rPr>
+        <w:t xml:space="preserve"> </w:t>
+      </w:r>
+      <w:proofErr w:type="spellStart"/>
+      <w:r>
+        <w:rPr>
+          <w:rFonts w:ascii="Times New Roman" w:hAnsi="Times New Roman"/>
+          <w:sz w:val="24"/>
+        </w:rPr>
+        <w:t>призна́чив</w:t>
+      </w:r>
+      <w:proofErr w:type="spellEnd"/>
+      <w:r>
+        <w:rPr>
+          <w:rFonts w:ascii="Times New Roman" w:hAnsi="Times New Roman"/>
+          <w:sz w:val="24"/>
+        </w:rPr>
+        <w:t>.</w:t>
+      </w:r>
+    </w:p>
+    <w:p>
+      <w:pPr>
+        <w:spacing w:after="120"/>
+      </w:pPr>
+      <w:proofErr w:type="spellStart"/>
+      <w:r>
+        <w:rPr>
+          <w:rFonts w:ascii="Times New Roman" w:hAnsi="Times New Roman"/>
+          <w:sz w:val="24"/>
+        </w:rPr>
+        <w:t>Поста́вив</w:t>
+      </w:r>
+      <w:proofErr w:type="spellEnd"/>
+      <w:r>
+        <w:rPr>
+          <w:rFonts w:ascii="Times New Roman" w:hAnsi="Times New Roman"/>
+          <w:sz w:val="24"/>
+        </w:rPr>
+        <w:t xml:space="preserve"> </w:t>
+      </w:r>
+      <w:proofErr w:type="spellStart"/>
+      <w:r>
+        <w:rPr>
+          <w:rFonts w:ascii="Times New Roman" w:hAnsi="Times New Roman"/>
+          <w:sz w:val="24"/>
+        </w:rPr>
+        <w:t>їм</w:t>
+      </w:r>
+      <w:proofErr w:type="spellEnd"/>
+      <w:r>
+        <w:rPr>
+          <w:rFonts w:ascii="Times New Roman" w:hAnsi="Times New Roman"/>
+          <w:sz w:val="24"/>
+        </w:rPr>
+        <w:t xml:space="preserve"> </w:t>
+      </w:r>
+      <w:proofErr w:type="spellStart"/>
+      <w:r>
+        <w:rPr>
+          <w:rFonts w:ascii="Times New Roman" w:hAnsi="Times New Roman"/>
+          <w:sz w:val="24"/>
+        </w:rPr>
+        <w:t>грани́цю</w:t>
+      </w:r>
+      <w:proofErr w:type="spellEnd"/>
+      <w:r>
+        <w:rPr>
+          <w:rFonts w:ascii="Times New Roman" w:hAnsi="Times New Roman"/>
+          <w:sz w:val="24"/>
+        </w:rPr>
+        <w:t xml:space="preserve">, </w:t>
+      </w:r>
+      <w:proofErr w:type="spellStart"/>
+      <w:r>
+        <w:rPr>
+          <w:rFonts w:ascii="Times New Roman" w:hAnsi="Times New Roman"/>
+          <w:sz w:val="24"/>
+        </w:rPr>
+        <w:t>яко́ї</w:t>
+      </w:r>
+      <w:proofErr w:type="spellEnd"/>
+      <w:r>
+        <w:rPr>
+          <w:rFonts w:ascii="Times New Roman" w:hAnsi="Times New Roman"/>
+          <w:sz w:val="24"/>
+        </w:rPr>
+        <w:t xml:space="preserve"> </w:t>
+      </w:r>
+      <w:proofErr w:type="spellStart"/>
+      <w:r>
+        <w:rPr>
+          <w:rFonts w:ascii="Times New Roman" w:hAnsi="Times New Roman"/>
+          <w:sz w:val="24"/>
+        </w:rPr>
+        <w:t>не</w:t>
+      </w:r>
+      <w:proofErr w:type="spellEnd"/>
+      <w:r>
+        <w:rPr>
+          <w:rFonts w:ascii="Times New Roman" w:hAnsi="Times New Roman"/>
+          <w:sz w:val="24"/>
+        </w:rPr>
+        <w:t xml:space="preserve"> </w:t>
+      </w:r>
+      <w:proofErr w:type="spellStart"/>
+      <w:proofErr w:type="gramStart"/>
+      <w:r>
+        <w:rPr>
+          <w:rFonts w:ascii="Times New Roman" w:hAnsi="Times New Roman"/>
+          <w:sz w:val="24"/>
+        </w:rPr>
+        <w:t>пере́йдуть</w:t>
+      </w:r>
+      <w:proofErr w:type="spellEnd"/>
+      <w:r>
+        <w:rPr>
+          <w:rFonts w:ascii="Times New Roman" w:hAnsi="Times New Roman"/>
+          <w:sz w:val="24"/>
+        </w:rPr>
+        <w:t>,*</w:t>
+      </w:r>
+      <w:proofErr w:type="gramEnd"/>
+      <w:r>
+        <w:rPr>
+          <w:rFonts w:ascii="Times New Roman" w:hAnsi="Times New Roman"/>
+          <w:sz w:val="24"/>
+        </w:rPr>
+        <w:t xml:space="preserve"> </w:t>
+      </w:r>
+      <w:proofErr w:type="spellStart"/>
+      <w:r>
+        <w:rPr>
+          <w:rFonts w:ascii="Times New Roman" w:hAnsi="Times New Roman"/>
+          <w:sz w:val="24"/>
+        </w:rPr>
+        <w:t>щоб</w:t>
+      </w:r>
+      <w:proofErr w:type="spellEnd"/>
+      <w:r>
+        <w:rPr>
+          <w:rFonts w:ascii="Times New Roman" w:hAnsi="Times New Roman"/>
+          <w:sz w:val="24"/>
+        </w:rPr>
+        <w:t xml:space="preserve"> </w:t>
+      </w:r>
+      <w:proofErr w:type="spellStart"/>
+      <w:r>
+        <w:rPr>
+          <w:rFonts w:ascii="Times New Roman" w:hAnsi="Times New Roman"/>
+          <w:sz w:val="24"/>
+        </w:rPr>
+        <w:t>зно́ву</w:t>
+      </w:r>
+      <w:proofErr w:type="spellEnd"/>
+      <w:r>
+        <w:rPr>
+          <w:rFonts w:ascii="Times New Roman" w:hAnsi="Times New Roman"/>
+          <w:sz w:val="24"/>
+        </w:rPr>
+        <w:t xml:space="preserve"> </w:t>
+      </w:r>
+      <w:proofErr w:type="spellStart"/>
+      <w:r>
+        <w:rPr>
+          <w:rFonts w:ascii="Times New Roman" w:hAnsi="Times New Roman"/>
+          <w:sz w:val="24"/>
+        </w:rPr>
+        <w:t>покри́ти</w:t>
+      </w:r>
+      <w:proofErr w:type="spellEnd"/>
+      <w:r>
+        <w:rPr>
+          <w:rFonts w:ascii="Times New Roman" w:hAnsi="Times New Roman"/>
+          <w:sz w:val="24"/>
+        </w:rPr>
+        <w:t xml:space="preserve"> </w:t>
+      </w:r>
+      <w:proofErr w:type="spellStart"/>
+      <w:r>
+        <w:rPr>
+          <w:rFonts w:ascii="Times New Roman" w:hAnsi="Times New Roman"/>
+          <w:sz w:val="24"/>
+        </w:rPr>
+        <w:t>зе́млю</w:t>
+      </w:r>
+      <w:proofErr w:type="spellEnd"/>
+      <w:r>
+        <w:rPr>
+          <w:rFonts w:ascii="Times New Roman" w:hAnsi="Times New Roman"/>
+          <w:sz w:val="24"/>
+        </w:rPr>
+        <w:t>.</w:t>
+      </w:r>
+    </w:p>
+    <w:p>
+      <w:pPr>
+        <w:spacing w:after="120"/>
+      </w:pPr>
+      <w:proofErr w:type="spellStart"/>
+      <w:r>
+        <w:rPr>
+          <w:rFonts w:ascii="Times New Roman" w:hAnsi="Times New Roman"/>
+          <w:sz w:val="24"/>
+        </w:rPr>
+        <w:t>Джере́ла</w:t>
+      </w:r>
+      <w:proofErr w:type="spellEnd"/>
+      <w:r>
+        <w:rPr>
+          <w:rFonts w:ascii="Times New Roman" w:hAnsi="Times New Roman"/>
+          <w:sz w:val="24"/>
+        </w:rPr>
+        <w:t xml:space="preserve"> </w:t>
+      </w:r>
+      <w:proofErr w:type="spellStart"/>
+      <w:r>
+        <w:rPr>
+          <w:rFonts w:ascii="Times New Roman" w:hAnsi="Times New Roman"/>
+          <w:sz w:val="24"/>
+        </w:rPr>
+        <w:t>посила́єш</w:t>
+      </w:r>
+      <w:proofErr w:type="spellEnd"/>
+      <w:r>
+        <w:rPr>
+          <w:rFonts w:ascii="Times New Roman" w:hAnsi="Times New Roman"/>
+          <w:sz w:val="24"/>
+        </w:rPr>
+        <w:t xml:space="preserve"> у </w:t>
+      </w:r>
+      <w:proofErr w:type="spellStart"/>
+      <w:proofErr w:type="gramStart"/>
+      <w:r>
+        <w:rPr>
+          <w:rFonts w:ascii="Times New Roman" w:hAnsi="Times New Roman"/>
+          <w:sz w:val="24"/>
+        </w:rPr>
+        <w:t>рі́ки</w:t>
+      </w:r>
+      <w:proofErr w:type="spellEnd"/>
+      <w:r>
+        <w:rPr>
+          <w:rFonts w:ascii="Times New Roman" w:hAnsi="Times New Roman"/>
+          <w:sz w:val="24"/>
+        </w:rPr>
+        <w:t>,*</w:t>
+      </w:r>
+      <w:proofErr w:type="gramEnd"/>
+      <w:r>
+        <w:rPr>
+          <w:rFonts w:ascii="Times New Roman" w:hAnsi="Times New Roman"/>
+          <w:sz w:val="24"/>
+        </w:rPr>
+        <w:t xml:space="preserve"> </w:t>
+      </w:r>
+      <w:proofErr w:type="spellStart"/>
+      <w:r>
+        <w:rPr>
+          <w:rFonts w:ascii="Times New Roman" w:hAnsi="Times New Roman"/>
+          <w:sz w:val="24"/>
+        </w:rPr>
+        <w:t>які</w:t>
+      </w:r>
+      <w:proofErr w:type="spellEnd"/>
+      <w:r>
+        <w:rPr>
+          <w:rFonts w:ascii="Times New Roman" w:hAnsi="Times New Roman"/>
+          <w:sz w:val="24"/>
+        </w:rPr>
+        <w:t xml:space="preserve">́ </w:t>
+      </w:r>
+      <w:proofErr w:type="spellStart"/>
+      <w:r>
+        <w:rPr>
+          <w:rFonts w:ascii="Times New Roman" w:hAnsi="Times New Roman"/>
+          <w:sz w:val="24"/>
+        </w:rPr>
+        <w:t>течу́ть</w:t>
+      </w:r>
+      <w:proofErr w:type="spellEnd"/>
+      <w:r>
+        <w:rPr>
+          <w:rFonts w:ascii="Times New Roman" w:hAnsi="Times New Roman"/>
+          <w:sz w:val="24"/>
+        </w:rPr>
+        <w:t xml:space="preserve"> </w:t>
+      </w:r>
+      <w:proofErr w:type="spellStart"/>
+      <w:r>
+        <w:rPr>
+          <w:rFonts w:ascii="Times New Roman" w:hAnsi="Times New Roman"/>
+          <w:sz w:val="24"/>
+        </w:rPr>
+        <w:t>по́між</w:t>
+      </w:r>
+      <w:proofErr w:type="spellEnd"/>
+      <w:r>
+        <w:rPr>
+          <w:rFonts w:ascii="Times New Roman" w:hAnsi="Times New Roman"/>
+          <w:sz w:val="24"/>
+        </w:rPr>
+        <w:t xml:space="preserve"> </w:t>
+      </w:r>
+      <w:proofErr w:type="spellStart"/>
+      <w:r>
+        <w:rPr>
+          <w:rFonts w:ascii="Times New Roman" w:hAnsi="Times New Roman"/>
+          <w:sz w:val="24"/>
+        </w:rPr>
+        <w:t>го́рами</w:t>
+      </w:r>
+      <w:proofErr w:type="spellEnd"/>
+      <w:r>
+        <w:rPr>
+          <w:rFonts w:ascii="Times New Roman" w:hAnsi="Times New Roman"/>
+          <w:sz w:val="24"/>
+        </w:rPr>
+        <w:t>.</w:t>
+      </w:r>
+    </w:p>
+    <w:p>
+      <w:pPr>
+        <w:spacing w:after="120"/>
+      </w:pPr>
+      <w:proofErr w:type="spellStart"/>
       <w:r>
         <w:rPr>
           <w:rFonts w:ascii="Times New Roman" w:hAnsi="Times New Roman"/>
           <w:sz w:val="24"/>
         </w:rPr>
         <w:lastRenderedPageBreak/>
-        <w:t>Усю́ звірину́, що в по́лі, вони́ напува́ють,* ди́кі осли́ там га́сять свою́ спра́гу.</w:t>
-      </w:r>
-    </w:p>
-    <w:p>
-      <w:pPr>
-        <w:spacing w:after="120"/>
-      </w:pPr>
-      <w:r>
-        <w:rPr>
-          <w:rFonts w:ascii="Times New Roman" w:hAnsi="Times New Roman"/>
-          <w:sz w:val="24"/>
-        </w:rPr>
-        <w:t>Над ни́ми ку́блиться небе́сне пта́ство,* з-по́між гілля́к дає́ свій го́лос.</w:t>
-      </w:r>
-    </w:p>
-    <w:p>
-      <w:pPr>
-        <w:spacing w:after="120"/>
-      </w:pPr>
-      <w:r>
-        <w:rPr>
-          <w:rFonts w:ascii="Times New Roman" w:hAnsi="Times New Roman"/>
-          <w:sz w:val="24"/>
-        </w:rPr>
-        <w:t>Ти напува́єш го́ри з Твої́х го́рниць,* земля́ наси́чується пло́дом діл Твої́х.</w:t>
-      </w:r>
-    </w:p>
-    <w:p>
-      <w:pPr>
-        <w:spacing w:after="120"/>
-      </w:pPr>
-      <w:r>
-        <w:rPr>
-          <w:rFonts w:ascii="Times New Roman" w:hAnsi="Times New Roman"/>
-          <w:sz w:val="24"/>
-        </w:rPr>
-        <w:t>Виро́щуєш траву́ для ско́ту, зе́ла – на вжи́ток лю́дям,* щоб хліб із землі́ добува́ли:</w:t>
-      </w:r>
-    </w:p>
-    <w:p>
-      <w:pPr>
-        <w:spacing w:after="120"/>
-      </w:pPr>
-      <w:r>
-        <w:rPr>
-          <w:rFonts w:ascii="Times New Roman" w:hAnsi="Times New Roman"/>
-          <w:sz w:val="24"/>
-        </w:rPr>
-        <w:t>Вино́, що се́рце лю́дське звеселя́є, олі́ю, щоб від не́ї ясні́ло обли́ччя,* і хліб, що скрі́плює се́рце лю́дське.</w:t>
-      </w:r>
-    </w:p>
-    <w:p>
-      <w:pPr>
-        <w:spacing w:after="120"/>
-      </w:pPr>
-      <w:r>
-        <w:rPr>
-          <w:rFonts w:ascii="Times New Roman" w:hAnsi="Times New Roman"/>
-          <w:sz w:val="24"/>
-        </w:rPr>
-        <w:t>Наси́чуються дере́ва Госпо́дні,* ке́дри лива́нські, що посади́в їх.</w:t>
-      </w:r>
-    </w:p>
-    <w:p>
-      <w:pPr>
-        <w:spacing w:after="120"/>
-      </w:pPr>
-      <w:r>
-        <w:rPr>
-          <w:rFonts w:ascii="Times New Roman" w:hAnsi="Times New Roman"/>
-          <w:sz w:val="24"/>
+        <w:t>Усю</w:t>
+      </w:r>
+      <w:proofErr w:type="spellEnd"/>
+      <w:r>
+        <w:rPr>
+          <w:rFonts w:ascii="Times New Roman" w:hAnsi="Times New Roman"/>
+          <w:sz w:val="24"/>
+        </w:rPr>
+        <w:t xml:space="preserve">́ </w:t>
+      </w:r>
+      <w:proofErr w:type="spellStart"/>
+      <w:r>
+        <w:rPr>
+          <w:rFonts w:ascii="Times New Roman" w:hAnsi="Times New Roman"/>
+          <w:sz w:val="24"/>
+        </w:rPr>
+        <w:t>звірину</w:t>
+      </w:r>
+      <w:proofErr w:type="spellEnd"/>
+      <w:r>
+        <w:rPr>
+          <w:rFonts w:ascii="Times New Roman" w:hAnsi="Times New Roman"/>
+          <w:sz w:val="24"/>
+        </w:rPr>
+        <w:t xml:space="preserve">́, що в </w:t>
+      </w:r>
+      <w:proofErr w:type="spellStart"/>
+      <w:r>
+        <w:rPr>
+          <w:rFonts w:ascii="Times New Roman" w:hAnsi="Times New Roman"/>
+          <w:sz w:val="24"/>
+        </w:rPr>
+        <w:t>по́лі</w:t>
+      </w:r>
+      <w:proofErr w:type="spellEnd"/>
+      <w:r>
+        <w:rPr>
+          <w:rFonts w:ascii="Times New Roman" w:hAnsi="Times New Roman"/>
+          <w:sz w:val="24"/>
+        </w:rPr>
+        <w:t xml:space="preserve">, </w:t>
+      </w:r>
+      <w:proofErr w:type="spellStart"/>
+      <w:r>
+        <w:rPr>
+          <w:rFonts w:ascii="Times New Roman" w:hAnsi="Times New Roman"/>
+          <w:sz w:val="24"/>
+        </w:rPr>
+        <w:t>вони</w:t>
+      </w:r>
+      <w:proofErr w:type="spellEnd"/>
+      <w:r>
+        <w:rPr>
+          <w:rFonts w:ascii="Times New Roman" w:hAnsi="Times New Roman"/>
+          <w:sz w:val="24"/>
+        </w:rPr>
+        <w:t xml:space="preserve">́ </w:t>
+      </w:r>
+      <w:proofErr w:type="spellStart"/>
+      <w:proofErr w:type="gramStart"/>
+      <w:r>
+        <w:rPr>
+          <w:rFonts w:ascii="Times New Roman" w:hAnsi="Times New Roman"/>
+          <w:sz w:val="24"/>
+        </w:rPr>
+        <w:t>напува́ють</w:t>
+      </w:r>
+      <w:proofErr w:type="spellEnd"/>
+      <w:r>
+        <w:rPr>
+          <w:rFonts w:ascii="Times New Roman" w:hAnsi="Times New Roman"/>
+          <w:sz w:val="24"/>
+        </w:rPr>
+        <w:t>,*</w:t>
+      </w:r>
+      <w:proofErr w:type="gramEnd"/>
+      <w:r>
+        <w:rPr>
+          <w:rFonts w:ascii="Times New Roman" w:hAnsi="Times New Roman"/>
+          <w:sz w:val="24"/>
+        </w:rPr>
+        <w:t xml:space="preserve"> </w:t>
+      </w:r>
+      <w:proofErr w:type="spellStart"/>
+      <w:r>
+        <w:rPr>
+          <w:rFonts w:ascii="Times New Roman" w:hAnsi="Times New Roman"/>
+          <w:sz w:val="24"/>
+        </w:rPr>
+        <w:t>ди́кі</w:t>
+      </w:r>
+      <w:proofErr w:type="spellEnd"/>
+      <w:r>
+        <w:rPr>
+          <w:rFonts w:ascii="Times New Roman" w:hAnsi="Times New Roman"/>
+          <w:sz w:val="24"/>
+        </w:rPr>
+        <w:t xml:space="preserve"> </w:t>
+      </w:r>
+      <w:proofErr w:type="spellStart"/>
+      <w:r>
+        <w:rPr>
+          <w:rFonts w:ascii="Times New Roman" w:hAnsi="Times New Roman"/>
+          <w:sz w:val="24"/>
+        </w:rPr>
+        <w:t>осли</w:t>
+      </w:r>
+      <w:proofErr w:type="spellEnd"/>
+      <w:r>
+        <w:rPr>
+          <w:rFonts w:ascii="Times New Roman" w:hAnsi="Times New Roman"/>
+          <w:sz w:val="24"/>
+        </w:rPr>
+        <w:t xml:space="preserve">́ </w:t>
+      </w:r>
+      <w:proofErr w:type="spellStart"/>
+      <w:r>
+        <w:rPr>
+          <w:rFonts w:ascii="Times New Roman" w:hAnsi="Times New Roman"/>
+          <w:sz w:val="24"/>
+        </w:rPr>
+        <w:t>там</w:t>
+      </w:r>
+      <w:proofErr w:type="spellEnd"/>
+      <w:r>
+        <w:rPr>
+          <w:rFonts w:ascii="Times New Roman" w:hAnsi="Times New Roman"/>
+          <w:sz w:val="24"/>
+        </w:rPr>
+        <w:t xml:space="preserve"> </w:t>
+      </w:r>
+      <w:proofErr w:type="spellStart"/>
+      <w:r>
+        <w:rPr>
+          <w:rFonts w:ascii="Times New Roman" w:hAnsi="Times New Roman"/>
+          <w:sz w:val="24"/>
+        </w:rPr>
+        <w:t>га́сять</w:t>
+      </w:r>
+      <w:proofErr w:type="spellEnd"/>
+      <w:r>
+        <w:rPr>
+          <w:rFonts w:ascii="Times New Roman" w:hAnsi="Times New Roman"/>
+          <w:sz w:val="24"/>
+        </w:rPr>
+        <w:t xml:space="preserve"> </w:t>
+      </w:r>
+      <w:proofErr w:type="spellStart"/>
+      <w:r>
+        <w:rPr>
+          <w:rFonts w:ascii="Times New Roman" w:hAnsi="Times New Roman"/>
+          <w:sz w:val="24"/>
+        </w:rPr>
+        <w:t>свою</w:t>
+      </w:r>
+      <w:proofErr w:type="spellEnd"/>
+      <w:r>
+        <w:rPr>
+          <w:rFonts w:ascii="Times New Roman" w:hAnsi="Times New Roman"/>
+          <w:sz w:val="24"/>
+        </w:rPr>
+        <w:t xml:space="preserve">́ </w:t>
+      </w:r>
+      <w:proofErr w:type="spellStart"/>
+      <w:r>
+        <w:rPr>
+          <w:rFonts w:ascii="Times New Roman" w:hAnsi="Times New Roman"/>
+          <w:sz w:val="24"/>
+        </w:rPr>
+        <w:t>спра́гу</w:t>
+      </w:r>
+      <w:proofErr w:type="spellEnd"/>
+      <w:r>
+        <w:rPr>
+          <w:rFonts w:ascii="Times New Roman" w:hAnsi="Times New Roman"/>
+          <w:sz w:val="24"/>
+        </w:rPr>
+        <w:t>.</w:t>
+      </w:r>
+    </w:p>
+    <w:p>
+      <w:pPr>
+        <w:spacing w:after="120"/>
+      </w:pPr>
+      <w:proofErr w:type="spellStart"/>
+      <w:r>
+        <w:rPr>
+          <w:rFonts w:ascii="Times New Roman" w:hAnsi="Times New Roman"/>
+          <w:sz w:val="24"/>
+        </w:rPr>
+        <w:t>Над</w:t>
+      </w:r>
+      <w:proofErr w:type="spellEnd"/>
+      <w:r>
+        <w:rPr>
+          <w:rFonts w:ascii="Times New Roman" w:hAnsi="Times New Roman"/>
+          <w:sz w:val="24"/>
+        </w:rPr>
+        <w:t xml:space="preserve"> </w:t>
+      </w:r>
+      <w:proofErr w:type="spellStart"/>
+      <w:r>
+        <w:rPr>
+          <w:rFonts w:ascii="Times New Roman" w:hAnsi="Times New Roman"/>
+          <w:sz w:val="24"/>
+        </w:rPr>
+        <w:t>ни́ми</w:t>
+      </w:r>
+      <w:proofErr w:type="spellEnd"/>
+      <w:r>
+        <w:rPr>
+          <w:rFonts w:ascii="Times New Roman" w:hAnsi="Times New Roman"/>
+          <w:sz w:val="24"/>
+        </w:rPr>
+        <w:t xml:space="preserve"> </w:t>
+      </w:r>
+      <w:proofErr w:type="spellStart"/>
+      <w:r>
+        <w:rPr>
+          <w:rFonts w:ascii="Times New Roman" w:hAnsi="Times New Roman"/>
+          <w:sz w:val="24"/>
+        </w:rPr>
+        <w:t>ку́блиться</w:t>
+      </w:r>
+      <w:proofErr w:type="spellEnd"/>
+      <w:r>
+        <w:rPr>
+          <w:rFonts w:ascii="Times New Roman" w:hAnsi="Times New Roman"/>
+          <w:sz w:val="24"/>
+        </w:rPr>
+        <w:t xml:space="preserve"> </w:t>
+      </w:r>
+      <w:proofErr w:type="spellStart"/>
+      <w:r>
+        <w:rPr>
+          <w:rFonts w:ascii="Times New Roman" w:hAnsi="Times New Roman"/>
+          <w:sz w:val="24"/>
+        </w:rPr>
+        <w:t>небе́сне</w:t>
+      </w:r>
+      <w:proofErr w:type="spellEnd"/>
+      <w:r>
+        <w:rPr>
+          <w:rFonts w:ascii="Times New Roman" w:hAnsi="Times New Roman"/>
+          <w:sz w:val="24"/>
+        </w:rPr>
+        <w:t xml:space="preserve"> </w:t>
+      </w:r>
+      <w:proofErr w:type="spellStart"/>
+      <w:proofErr w:type="gramStart"/>
+      <w:r>
+        <w:rPr>
+          <w:rFonts w:ascii="Times New Roman" w:hAnsi="Times New Roman"/>
+          <w:sz w:val="24"/>
+        </w:rPr>
+        <w:t>пта́ство</w:t>
+      </w:r>
+      <w:proofErr w:type="spellEnd"/>
+      <w:r>
+        <w:rPr>
+          <w:rFonts w:ascii="Times New Roman" w:hAnsi="Times New Roman"/>
+          <w:sz w:val="24"/>
+        </w:rPr>
+        <w:t>,*</w:t>
+      </w:r>
+      <w:proofErr w:type="gramEnd"/>
+      <w:r>
+        <w:rPr>
+          <w:rFonts w:ascii="Times New Roman" w:hAnsi="Times New Roman"/>
+          <w:sz w:val="24"/>
+        </w:rPr>
+        <w:t xml:space="preserve"> </w:t>
+      </w:r>
+      <w:proofErr w:type="spellStart"/>
+      <w:r>
+        <w:rPr>
+          <w:rFonts w:ascii="Times New Roman" w:hAnsi="Times New Roman"/>
+          <w:sz w:val="24"/>
+        </w:rPr>
+        <w:t>з-по́між</w:t>
+      </w:r>
+      <w:proofErr w:type="spellEnd"/>
+      <w:r>
+        <w:rPr>
+          <w:rFonts w:ascii="Times New Roman" w:hAnsi="Times New Roman"/>
+          <w:sz w:val="24"/>
+        </w:rPr>
+        <w:t xml:space="preserve"> </w:t>
+      </w:r>
+      <w:proofErr w:type="spellStart"/>
+      <w:r>
+        <w:rPr>
+          <w:rFonts w:ascii="Times New Roman" w:hAnsi="Times New Roman"/>
+          <w:sz w:val="24"/>
+        </w:rPr>
+        <w:t>гілля́к</w:t>
+      </w:r>
+      <w:proofErr w:type="spellEnd"/>
+      <w:r>
+        <w:rPr>
+          <w:rFonts w:ascii="Times New Roman" w:hAnsi="Times New Roman"/>
+          <w:sz w:val="24"/>
+        </w:rPr>
+        <w:t xml:space="preserve"> </w:t>
+      </w:r>
+      <w:proofErr w:type="spellStart"/>
+      <w:r>
+        <w:rPr>
+          <w:rFonts w:ascii="Times New Roman" w:hAnsi="Times New Roman"/>
+          <w:sz w:val="24"/>
+        </w:rPr>
+        <w:t>дає</w:t>
+      </w:r>
+      <w:proofErr w:type="spellEnd"/>
+      <w:r>
+        <w:rPr>
+          <w:rFonts w:ascii="Times New Roman" w:hAnsi="Times New Roman"/>
+          <w:sz w:val="24"/>
+        </w:rPr>
+        <w:t xml:space="preserve">́ </w:t>
+      </w:r>
+      <w:proofErr w:type="spellStart"/>
+      <w:r>
+        <w:rPr>
+          <w:rFonts w:ascii="Times New Roman" w:hAnsi="Times New Roman"/>
+          <w:sz w:val="24"/>
+        </w:rPr>
+        <w:t>свій</w:t>
+      </w:r>
+      <w:proofErr w:type="spellEnd"/>
+      <w:r>
+        <w:rPr>
+          <w:rFonts w:ascii="Times New Roman" w:hAnsi="Times New Roman"/>
+          <w:sz w:val="24"/>
+        </w:rPr>
+        <w:t xml:space="preserve"> </w:t>
+      </w:r>
+      <w:proofErr w:type="spellStart"/>
+      <w:r>
+        <w:rPr>
+          <w:rFonts w:ascii="Times New Roman" w:hAnsi="Times New Roman"/>
+          <w:sz w:val="24"/>
+        </w:rPr>
+        <w:t>го́лос</w:t>
+      </w:r>
+      <w:proofErr w:type="spellEnd"/>
+      <w:r>
+        <w:rPr>
+          <w:rFonts w:ascii="Times New Roman" w:hAnsi="Times New Roman"/>
+          <w:sz w:val="24"/>
+        </w:rPr>
+        <w:t>.</w:t>
+      </w:r>
+    </w:p>
+    <w:p>
+      <w:pPr>
+        <w:spacing w:after="120"/>
+      </w:pPr>
+      <w:r>
+        <w:rPr>
+          <w:rFonts w:ascii="Times New Roman" w:hAnsi="Times New Roman"/>
+          <w:sz w:val="24"/>
+        </w:rPr>
+        <w:t xml:space="preserve">Ти </w:t>
+      </w:r>
+      <w:proofErr w:type="spellStart"/>
+      <w:r>
+        <w:rPr>
+          <w:rFonts w:ascii="Times New Roman" w:hAnsi="Times New Roman"/>
+          <w:sz w:val="24"/>
+        </w:rPr>
+        <w:t>напува́єш</w:t>
+      </w:r>
+      <w:proofErr w:type="spellEnd"/>
+      <w:r>
+        <w:rPr>
+          <w:rFonts w:ascii="Times New Roman" w:hAnsi="Times New Roman"/>
+          <w:sz w:val="24"/>
+        </w:rPr>
+        <w:t xml:space="preserve"> </w:t>
+      </w:r>
+      <w:proofErr w:type="spellStart"/>
+      <w:r>
+        <w:rPr>
+          <w:rFonts w:ascii="Times New Roman" w:hAnsi="Times New Roman"/>
+          <w:sz w:val="24"/>
+        </w:rPr>
+        <w:t>го́ри</w:t>
+      </w:r>
+      <w:proofErr w:type="spellEnd"/>
+      <w:r>
+        <w:rPr>
+          <w:rFonts w:ascii="Times New Roman" w:hAnsi="Times New Roman"/>
+          <w:sz w:val="24"/>
+        </w:rPr>
+        <w:t xml:space="preserve"> з </w:t>
+      </w:r>
+      <w:proofErr w:type="spellStart"/>
+      <w:r>
+        <w:rPr>
+          <w:rFonts w:ascii="Times New Roman" w:hAnsi="Times New Roman"/>
+          <w:sz w:val="24"/>
+        </w:rPr>
+        <w:t>Твої́х</w:t>
+      </w:r>
+      <w:proofErr w:type="spellEnd"/>
+      <w:r>
+        <w:rPr>
+          <w:rFonts w:ascii="Times New Roman" w:hAnsi="Times New Roman"/>
+          <w:sz w:val="24"/>
+        </w:rPr>
+        <w:t xml:space="preserve"> </w:t>
+      </w:r>
+      <w:proofErr w:type="spellStart"/>
+      <w:proofErr w:type="gramStart"/>
+      <w:r>
+        <w:rPr>
+          <w:rFonts w:ascii="Times New Roman" w:hAnsi="Times New Roman"/>
+          <w:sz w:val="24"/>
+        </w:rPr>
+        <w:t>го́рниць</w:t>
+      </w:r>
+      <w:proofErr w:type="spellEnd"/>
+      <w:r>
+        <w:rPr>
+          <w:rFonts w:ascii="Times New Roman" w:hAnsi="Times New Roman"/>
+          <w:sz w:val="24"/>
+        </w:rPr>
+        <w:t>,*</w:t>
+      </w:r>
+      <w:proofErr w:type="gramEnd"/>
+      <w:r>
+        <w:rPr>
+          <w:rFonts w:ascii="Times New Roman" w:hAnsi="Times New Roman"/>
+          <w:sz w:val="24"/>
+        </w:rPr>
+        <w:t xml:space="preserve"> </w:t>
+      </w:r>
+      <w:proofErr w:type="spellStart"/>
+      <w:r>
+        <w:rPr>
+          <w:rFonts w:ascii="Times New Roman" w:hAnsi="Times New Roman"/>
+          <w:sz w:val="24"/>
+        </w:rPr>
+        <w:t>земля</w:t>
+      </w:r>
+      <w:proofErr w:type="spellEnd"/>
+      <w:r>
+        <w:rPr>
+          <w:rFonts w:ascii="Times New Roman" w:hAnsi="Times New Roman"/>
+          <w:sz w:val="24"/>
+        </w:rPr>
+        <w:t xml:space="preserve">́ </w:t>
+      </w:r>
+      <w:proofErr w:type="spellStart"/>
+      <w:r>
+        <w:rPr>
+          <w:rFonts w:ascii="Times New Roman" w:hAnsi="Times New Roman"/>
+          <w:sz w:val="24"/>
+        </w:rPr>
+        <w:t>наси́чується</w:t>
+      </w:r>
+      <w:proofErr w:type="spellEnd"/>
+      <w:r>
+        <w:rPr>
+          <w:rFonts w:ascii="Times New Roman" w:hAnsi="Times New Roman"/>
+          <w:sz w:val="24"/>
+        </w:rPr>
+        <w:t xml:space="preserve"> </w:t>
+      </w:r>
+      <w:proofErr w:type="spellStart"/>
+      <w:r>
+        <w:rPr>
+          <w:rFonts w:ascii="Times New Roman" w:hAnsi="Times New Roman"/>
+          <w:sz w:val="24"/>
+        </w:rPr>
+        <w:t>пло́дом</w:t>
+      </w:r>
+      <w:proofErr w:type="spellEnd"/>
+      <w:r>
+        <w:rPr>
+          <w:rFonts w:ascii="Times New Roman" w:hAnsi="Times New Roman"/>
+          <w:sz w:val="24"/>
+        </w:rPr>
+        <w:t xml:space="preserve"> </w:t>
+      </w:r>
+      <w:proofErr w:type="spellStart"/>
+      <w:r>
+        <w:rPr>
+          <w:rFonts w:ascii="Times New Roman" w:hAnsi="Times New Roman"/>
+          <w:sz w:val="24"/>
+        </w:rPr>
+        <w:t>діл</w:t>
+      </w:r>
+      <w:proofErr w:type="spellEnd"/>
+      <w:r>
+        <w:rPr>
+          <w:rFonts w:ascii="Times New Roman" w:hAnsi="Times New Roman"/>
+          <w:sz w:val="24"/>
+        </w:rPr>
+        <w:t xml:space="preserve"> </w:t>
+      </w:r>
+      <w:proofErr w:type="spellStart"/>
+      <w:r>
+        <w:rPr>
+          <w:rFonts w:ascii="Times New Roman" w:hAnsi="Times New Roman"/>
+          <w:sz w:val="24"/>
+        </w:rPr>
+        <w:t>Твої́х</w:t>
+      </w:r>
+      <w:proofErr w:type="spellEnd"/>
+      <w:r>
+        <w:rPr>
+          <w:rFonts w:ascii="Times New Roman" w:hAnsi="Times New Roman"/>
+          <w:sz w:val="24"/>
+        </w:rPr>
+        <w:t>.</w:t>
+      </w:r>
+    </w:p>
+    <w:p>
+      <w:pPr>
+        <w:spacing w:after="120"/>
+      </w:pPr>
+      <w:proofErr w:type="spellStart"/>
+      <w:r>
+        <w:rPr>
+          <w:rFonts w:ascii="Times New Roman" w:hAnsi="Times New Roman"/>
+          <w:sz w:val="24"/>
+        </w:rPr>
+        <w:t>Виро́щуєш</w:t>
+      </w:r>
+      <w:proofErr w:type="spellEnd"/>
+      <w:r>
+        <w:rPr>
+          <w:rFonts w:ascii="Times New Roman" w:hAnsi="Times New Roman"/>
+          <w:sz w:val="24"/>
+        </w:rPr>
+        <w:t xml:space="preserve"> </w:t>
+      </w:r>
+      <w:proofErr w:type="spellStart"/>
+      <w:r>
+        <w:rPr>
+          <w:rFonts w:ascii="Times New Roman" w:hAnsi="Times New Roman"/>
+          <w:sz w:val="24"/>
+        </w:rPr>
+        <w:t>траву</w:t>
+      </w:r>
+      <w:proofErr w:type="spellEnd"/>
+      <w:r>
+        <w:rPr>
+          <w:rFonts w:ascii="Times New Roman" w:hAnsi="Times New Roman"/>
+          <w:sz w:val="24"/>
+        </w:rPr>
+        <w:t xml:space="preserve">́ </w:t>
+      </w:r>
+      <w:proofErr w:type="spellStart"/>
+      <w:r>
+        <w:rPr>
+          <w:rFonts w:ascii="Times New Roman" w:hAnsi="Times New Roman"/>
+          <w:sz w:val="24"/>
+        </w:rPr>
+        <w:t>для</w:t>
+      </w:r>
+      <w:proofErr w:type="spellEnd"/>
+      <w:r>
+        <w:rPr>
+          <w:rFonts w:ascii="Times New Roman" w:hAnsi="Times New Roman"/>
+          <w:sz w:val="24"/>
+        </w:rPr>
+        <w:t xml:space="preserve"> </w:t>
+      </w:r>
+      <w:proofErr w:type="spellStart"/>
+      <w:r>
+        <w:rPr>
+          <w:rFonts w:ascii="Times New Roman" w:hAnsi="Times New Roman"/>
+          <w:sz w:val="24"/>
+        </w:rPr>
+        <w:t>ско́ту</w:t>
+      </w:r>
+      <w:proofErr w:type="spellEnd"/>
+      <w:r>
+        <w:rPr>
+          <w:rFonts w:ascii="Times New Roman" w:hAnsi="Times New Roman"/>
+          <w:sz w:val="24"/>
+        </w:rPr>
+        <w:t xml:space="preserve">, </w:t>
+      </w:r>
+      <w:proofErr w:type="spellStart"/>
+      <w:r>
+        <w:rPr>
+          <w:rFonts w:ascii="Times New Roman" w:hAnsi="Times New Roman"/>
+          <w:sz w:val="24"/>
+        </w:rPr>
+        <w:t>зе́ла</w:t>
+      </w:r>
+      <w:proofErr w:type="spellEnd"/>
+      <w:r>
+        <w:rPr>
+          <w:rFonts w:ascii="Times New Roman" w:hAnsi="Times New Roman"/>
+          <w:sz w:val="24"/>
+        </w:rPr>
+        <w:t xml:space="preserve"> – на </w:t>
+      </w:r>
+      <w:proofErr w:type="spellStart"/>
+      <w:r>
+        <w:rPr>
+          <w:rFonts w:ascii="Times New Roman" w:hAnsi="Times New Roman"/>
+          <w:sz w:val="24"/>
+        </w:rPr>
+        <w:t>вжи́ток</w:t>
+      </w:r>
+      <w:proofErr w:type="spellEnd"/>
+      <w:r>
+        <w:rPr>
+          <w:rFonts w:ascii="Times New Roman" w:hAnsi="Times New Roman"/>
+          <w:sz w:val="24"/>
+        </w:rPr>
+        <w:t xml:space="preserve"> </w:t>
+      </w:r>
+      <w:proofErr w:type="spellStart"/>
+      <w:proofErr w:type="gramStart"/>
+      <w:r>
+        <w:rPr>
+          <w:rFonts w:ascii="Times New Roman" w:hAnsi="Times New Roman"/>
+          <w:sz w:val="24"/>
+        </w:rPr>
+        <w:t>лю́дям</w:t>
+      </w:r>
+      <w:proofErr w:type="spellEnd"/>
+      <w:r>
+        <w:rPr>
+          <w:rFonts w:ascii="Times New Roman" w:hAnsi="Times New Roman"/>
+          <w:sz w:val="24"/>
+        </w:rPr>
+        <w:t>,*</w:t>
+      </w:r>
+      <w:proofErr w:type="gramEnd"/>
+      <w:r>
+        <w:rPr>
+          <w:rFonts w:ascii="Times New Roman" w:hAnsi="Times New Roman"/>
+          <w:sz w:val="24"/>
+        </w:rPr>
+        <w:t xml:space="preserve"> </w:t>
+      </w:r>
+      <w:proofErr w:type="spellStart"/>
+      <w:r>
+        <w:rPr>
+          <w:rFonts w:ascii="Times New Roman" w:hAnsi="Times New Roman"/>
+          <w:sz w:val="24"/>
+        </w:rPr>
+        <w:t>щоб</w:t>
+      </w:r>
+      <w:proofErr w:type="spellEnd"/>
+      <w:r>
+        <w:rPr>
+          <w:rFonts w:ascii="Times New Roman" w:hAnsi="Times New Roman"/>
+          <w:sz w:val="24"/>
+        </w:rPr>
+        <w:t xml:space="preserve"> </w:t>
+      </w:r>
+      <w:proofErr w:type="spellStart"/>
+      <w:r>
+        <w:rPr>
+          <w:rFonts w:ascii="Times New Roman" w:hAnsi="Times New Roman"/>
+          <w:sz w:val="24"/>
+        </w:rPr>
+        <w:t>хліб</w:t>
+      </w:r>
+      <w:proofErr w:type="spellEnd"/>
+      <w:r>
+        <w:rPr>
+          <w:rFonts w:ascii="Times New Roman" w:hAnsi="Times New Roman"/>
+          <w:sz w:val="24"/>
+        </w:rPr>
+        <w:t xml:space="preserve"> </w:t>
+      </w:r>
+      <w:proofErr w:type="spellStart"/>
+      <w:r>
+        <w:rPr>
+          <w:rFonts w:ascii="Times New Roman" w:hAnsi="Times New Roman"/>
+          <w:sz w:val="24"/>
+        </w:rPr>
+        <w:t>із</w:t>
+      </w:r>
+      <w:proofErr w:type="spellEnd"/>
+      <w:r>
+        <w:rPr>
+          <w:rFonts w:ascii="Times New Roman" w:hAnsi="Times New Roman"/>
+          <w:sz w:val="24"/>
+        </w:rPr>
+        <w:t xml:space="preserve"> </w:t>
+      </w:r>
+      <w:proofErr w:type="spellStart"/>
+      <w:r>
+        <w:rPr>
+          <w:rFonts w:ascii="Times New Roman" w:hAnsi="Times New Roman"/>
+          <w:sz w:val="24"/>
+        </w:rPr>
+        <w:t>землі</w:t>
+      </w:r>
+      <w:proofErr w:type="spellEnd"/>
+      <w:r>
+        <w:rPr>
+          <w:rFonts w:ascii="Times New Roman" w:hAnsi="Times New Roman"/>
+          <w:sz w:val="24"/>
+        </w:rPr>
+        <w:t xml:space="preserve">́ </w:t>
+      </w:r>
+      <w:proofErr w:type="spellStart"/>
+      <w:r>
+        <w:rPr>
+          <w:rFonts w:ascii="Times New Roman" w:hAnsi="Times New Roman"/>
+          <w:sz w:val="24"/>
+        </w:rPr>
+        <w:t>добува́ли</w:t>
+      </w:r>
+      <w:proofErr w:type="spellEnd"/>
+      <w:r>
+        <w:rPr>
+          <w:rFonts w:ascii="Times New Roman" w:hAnsi="Times New Roman"/>
+          <w:sz w:val="24"/>
+        </w:rPr>
+        <w:t>:</w:t>
+      </w:r>
+    </w:p>
+    <w:p>
+      <w:pPr>
+        <w:spacing w:after="120"/>
+      </w:pPr>
+      <w:proofErr w:type="spellStart"/>
+      <w:r>
+        <w:rPr>
+          <w:rFonts w:ascii="Times New Roman" w:hAnsi="Times New Roman"/>
+          <w:sz w:val="24"/>
+        </w:rPr>
+        <w:t>Вино</w:t>
+      </w:r>
+      <w:proofErr w:type="spellEnd"/>
+      <w:r>
+        <w:rPr>
+          <w:rFonts w:ascii="Times New Roman" w:hAnsi="Times New Roman"/>
+          <w:sz w:val="24"/>
+        </w:rPr>
+        <w:t xml:space="preserve">́, що </w:t>
+      </w:r>
+      <w:proofErr w:type="spellStart"/>
+      <w:r>
+        <w:rPr>
+          <w:rFonts w:ascii="Times New Roman" w:hAnsi="Times New Roman"/>
+          <w:sz w:val="24"/>
+        </w:rPr>
+        <w:t>се́рце</w:t>
+      </w:r>
+      <w:proofErr w:type="spellEnd"/>
+      <w:r>
+        <w:rPr>
+          <w:rFonts w:ascii="Times New Roman" w:hAnsi="Times New Roman"/>
+          <w:sz w:val="24"/>
+        </w:rPr>
+        <w:t xml:space="preserve"> </w:t>
+      </w:r>
+      <w:proofErr w:type="spellStart"/>
+      <w:r>
+        <w:rPr>
+          <w:rFonts w:ascii="Times New Roman" w:hAnsi="Times New Roman"/>
+          <w:sz w:val="24"/>
+        </w:rPr>
+        <w:t>лю́дське</w:t>
+      </w:r>
+      <w:proofErr w:type="spellEnd"/>
+      <w:r>
+        <w:rPr>
+          <w:rFonts w:ascii="Times New Roman" w:hAnsi="Times New Roman"/>
+          <w:sz w:val="24"/>
+        </w:rPr>
+        <w:t xml:space="preserve"> </w:t>
+      </w:r>
+      <w:proofErr w:type="spellStart"/>
+      <w:r>
+        <w:rPr>
+          <w:rFonts w:ascii="Times New Roman" w:hAnsi="Times New Roman"/>
+          <w:sz w:val="24"/>
+        </w:rPr>
+        <w:t>звеселя́є</w:t>
+      </w:r>
+      <w:proofErr w:type="spellEnd"/>
+      <w:r>
+        <w:rPr>
+          <w:rFonts w:ascii="Times New Roman" w:hAnsi="Times New Roman"/>
+          <w:sz w:val="24"/>
+        </w:rPr>
+        <w:t xml:space="preserve">, </w:t>
+      </w:r>
+      <w:proofErr w:type="spellStart"/>
+      <w:r>
+        <w:rPr>
+          <w:rFonts w:ascii="Times New Roman" w:hAnsi="Times New Roman"/>
+          <w:sz w:val="24"/>
+        </w:rPr>
+        <w:t>олі́ю</w:t>
+      </w:r>
+      <w:proofErr w:type="spellEnd"/>
+      <w:r>
+        <w:rPr>
+          <w:rFonts w:ascii="Times New Roman" w:hAnsi="Times New Roman"/>
+          <w:sz w:val="24"/>
+        </w:rPr>
+        <w:t xml:space="preserve">, </w:t>
+      </w:r>
+      <w:proofErr w:type="spellStart"/>
+      <w:r>
+        <w:rPr>
+          <w:rFonts w:ascii="Times New Roman" w:hAnsi="Times New Roman"/>
+          <w:sz w:val="24"/>
+        </w:rPr>
+        <w:t>щоб</w:t>
+      </w:r>
+      <w:proofErr w:type="spellEnd"/>
+      <w:r>
+        <w:rPr>
+          <w:rFonts w:ascii="Times New Roman" w:hAnsi="Times New Roman"/>
+          <w:sz w:val="24"/>
+        </w:rPr>
+        <w:t xml:space="preserve"> </w:t>
+      </w:r>
+      <w:proofErr w:type="spellStart"/>
+      <w:r>
+        <w:rPr>
+          <w:rFonts w:ascii="Times New Roman" w:hAnsi="Times New Roman"/>
+          <w:sz w:val="24"/>
+        </w:rPr>
+        <w:t>від</w:t>
+      </w:r>
+      <w:proofErr w:type="spellEnd"/>
+      <w:r>
+        <w:rPr>
+          <w:rFonts w:ascii="Times New Roman" w:hAnsi="Times New Roman"/>
+          <w:sz w:val="24"/>
+        </w:rPr>
+        <w:t xml:space="preserve"> </w:t>
+      </w:r>
+      <w:proofErr w:type="spellStart"/>
+      <w:r>
+        <w:rPr>
+          <w:rFonts w:ascii="Times New Roman" w:hAnsi="Times New Roman"/>
+          <w:sz w:val="24"/>
+        </w:rPr>
+        <w:t>не́ї</w:t>
+      </w:r>
+      <w:proofErr w:type="spellEnd"/>
+      <w:r>
+        <w:rPr>
+          <w:rFonts w:ascii="Times New Roman" w:hAnsi="Times New Roman"/>
+          <w:sz w:val="24"/>
+        </w:rPr>
+        <w:t xml:space="preserve"> </w:t>
+      </w:r>
+      <w:proofErr w:type="spellStart"/>
+      <w:r>
+        <w:rPr>
+          <w:rFonts w:ascii="Times New Roman" w:hAnsi="Times New Roman"/>
+          <w:sz w:val="24"/>
+        </w:rPr>
+        <w:t>ясні́ло</w:t>
+      </w:r>
+      <w:proofErr w:type="spellEnd"/>
+      <w:r>
+        <w:rPr>
+          <w:rFonts w:ascii="Times New Roman" w:hAnsi="Times New Roman"/>
+          <w:sz w:val="24"/>
+        </w:rPr>
+        <w:t xml:space="preserve"> </w:t>
+      </w:r>
+      <w:proofErr w:type="spellStart"/>
+      <w:proofErr w:type="gramStart"/>
+      <w:r>
+        <w:rPr>
+          <w:rFonts w:ascii="Times New Roman" w:hAnsi="Times New Roman"/>
+          <w:sz w:val="24"/>
+        </w:rPr>
+        <w:t>обли́ччя</w:t>
+      </w:r>
+      <w:proofErr w:type="spellEnd"/>
+      <w:r>
+        <w:rPr>
+          <w:rFonts w:ascii="Times New Roman" w:hAnsi="Times New Roman"/>
+          <w:sz w:val="24"/>
+        </w:rPr>
+        <w:t>,*</w:t>
+      </w:r>
+      <w:proofErr w:type="gramEnd"/>
+      <w:r>
+        <w:rPr>
+          <w:rFonts w:ascii="Times New Roman" w:hAnsi="Times New Roman"/>
+          <w:sz w:val="24"/>
+        </w:rPr>
+        <w:t xml:space="preserve"> і </w:t>
+      </w:r>
+      <w:proofErr w:type="spellStart"/>
+      <w:r>
+        <w:rPr>
+          <w:rFonts w:ascii="Times New Roman" w:hAnsi="Times New Roman"/>
+          <w:sz w:val="24"/>
+        </w:rPr>
+        <w:t>хліб</w:t>
+      </w:r>
+      <w:proofErr w:type="spellEnd"/>
+      <w:r>
+        <w:rPr>
+          <w:rFonts w:ascii="Times New Roman" w:hAnsi="Times New Roman"/>
+          <w:sz w:val="24"/>
+        </w:rPr>
+        <w:t xml:space="preserve">, що </w:t>
+      </w:r>
+      <w:proofErr w:type="spellStart"/>
+      <w:r>
+        <w:rPr>
+          <w:rFonts w:ascii="Times New Roman" w:hAnsi="Times New Roman"/>
+          <w:sz w:val="24"/>
+        </w:rPr>
+        <w:t>скрі́плює</w:t>
+      </w:r>
+      <w:proofErr w:type="spellEnd"/>
+      <w:r>
+        <w:rPr>
+          <w:rFonts w:ascii="Times New Roman" w:hAnsi="Times New Roman"/>
+          <w:sz w:val="24"/>
+        </w:rPr>
+        <w:t xml:space="preserve"> </w:t>
+      </w:r>
+      <w:proofErr w:type="spellStart"/>
+      <w:r>
+        <w:rPr>
+          <w:rFonts w:ascii="Times New Roman" w:hAnsi="Times New Roman"/>
+          <w:sz w:val="24"/>
+        </w:rPr>
+        <w:t>се́рце</w:t>
+      </w:r>
+      <w:proofErr w:type="spellEnd"/>
+      <w:r>
+        <w:rPr>
+          <w:rFonts w:ascii="Times New Roman" w:hAnsi="Times New Roman"/>
+          <w:sz w:val="24"/>
+        </w:rPr>
+        <w:t xml:space="preserve"> </w:t>
+      </w:r>
+      <w:proofErr w:type="spellStart"/>
+      <w:r>
+        <w:rPr>
+          <w:rFonts w:ascii="Times New Roman" w:hAnsi="Times New Roman"/>
+          <w:sz w:val="24"/>
+        </w:rPr>
+        <w:t>лю́дське</w:t>
+      </w:r>
+      <w:proofErr w:type="spellEnd"/>
+      <w:r>
+        <w:rPr>
+          <w:rFonts w:ascii="Times New Roman" w:hAnsi="Times New Roman"/>
+          <w:sz w:val="24"/>
+        </w:rPr>
+        <w:t>.</w:t>
+      </w:r>
+    </w:p>
+    <w:p>
+      <w:pPr>
+        <w:spacing w:after="120"/>
+      </w:pPr>
+      <w:proofErr w:type="spellStart"/>
+      <w:r>
+        <w:rPr>
+          <w:rFonts w:ascii="Times New Roman" w:hAnsi="Times New Roman"/>
+          <w:sz w:val="24"/>
+        </w:rPr>
+        <w:t>Наси́чуються</w:t>
+      </w:r>
+      <w:proofErr w:type="spellEnd"/>
+      <w:r>
+        <w:rPr>
+          <w:rFonts w:ascii="Times New Roman" w:hAnsi="Times New Roman"/>
+          <w:sz w:val="24"/>
+        </w:rPr>
+        <w:t xml:space="preserve"> </w:t>
+      </w:r>
+      <w:proofErr w:type="spellStart"/>
+      <w:r>
+        <w:rPr>
+          <w:rFonts w:ascii="Times New Roman" w:hAnsi="Times New Roman"/>
+          <w:sz w:val="24"/>
+        </w:rPr>
+        <w:t>дере́ва</w:t>
+      </w:r>
+      <w:proofErr w:type="spellEnd"/>
+      <w:r>
+        <w:rPr>
+          <w:rFonts w:ascii="Times New Roman" w:hAnsi="Times New Roman"/>
+          <w:sz w:val="24"/>
+        </w:rPr>
+        <w:t xml:space="preserve"> </w:t>
+      </w:r>
+      <w:proofErr w:type="spellStart"/>
+      <w:proofErr w:type="gramStart"/>
+      <w:r>
+        <w:rPr>
+          <w:rFonts w:ascii="Times New Roman" w:hAnsi="Times New Roman"/>
+          <w:sz w:val="24"/>
+        </w:rPr>
+        <w:t>Госпо́дні</w:t>
+      </w:r>
+      <w:proofErr w:type="spellEnd"/>
+      <w:r>
+        <w:rPr>
+          <w:rFonts w:ascii="Times New Roman" w:hAnsi="Times New Roman"/>
+          <w:sz w:val="24"/>
+        </w:rPr>
+        <w:t>,*</w:t>
+      </w:r>
+      <w:proofErr w:type="gramEnd"/>
+      <w:r>
+        <w:rPr>
+          <w:rFonts w:ascii="Times New Roman" w:hAnsi="Times New Roman"/>
+          <w:sz w:val="24"/>
+        </w:rPr>
+        <w:t xml:space="preserve"> </w:t>
+      </w:r>
+      <w:proofErr w:type="spellStart"/>
+      <w:r>
+        <w:rPr>
+          <w:rFonts w:ascii="Times New Roman" w:hAnsi="Times New Roman"/>
+          <w:sz w:val="24"/>
+        </w:rPr>
+        <w:t>ке́дри</w:t>
+      </w:r>
+      <w:proofErr w:type="spellEnd"/>
+      <w:r>
+        <w:rPr>
+          <w:rFonts w:ascii="Times New Roman" w:hAnsi="Times New Roman"/>
+          <w:sz w:val="24"/>
+        </w:rPr>
+        <w:t xml:space="preserve"> </w:t>
+      </w:r>
+      <w:proofErr w:type="spellStart"/>
+      <w:r>
+        <w:rPr>
+          <w:rFonts w:ascii="Times New Roman" w:hAnsi="Times New Roman"/>
+          <w:sz w:val="24"/>
+        </w:rPr>
+        <w:t>лива́нські</w:t>
+      </w:r>
+      <w:proofErr w:type="spellEnd"/>
+      <w:r>
+        <w:rPr>
+          <w:rFonts w:ascii="Times New Roman" w:hAnsi="Times New Roman"/>
+          <w:sz w:val="24"/>
+        </w:rPr>
+        <w:t xml:space="preserve">, що </w:t>
+      </w:r>
+      <w:proofErr w:type="spellStart"/>
+      <w:r>
+        <w:rPr>
+          <w:rFonts w:ascii="Times New Roman" w:hAnsi="Times New Roman"/>
+          <w:sz w:val="24"/>
+        </w:rPr>
+        <w:t>посади́в</w:t>
+      </w:r>
+      <w:proofErr w:type="spellEnd"/>
+      <w:r>
+        <w:rPr>
+          <w:rFonts w:ascii="Times New Roman" w:hAnsi="Times New Roman"/>
+          <w:sz w:val="24"/>
+        </w:rPr>
+        <w:t xml:space="preserve"> </w:t>
+      </w:r>
+      <w:proofErr w:type="spellStart"/>
+      <w:r>
+        <w:rPr>
+          <w:rFonts w:ascii="Times New Roman" w:hAnsi="Times New Roman"/>
+          <w:sz w:val="24"/>
+        </w:rPr>
+        <w:t>їх</w:t>
+      </w:r>
+      <w:proofErr w:type="spellEnd"/>
+      <w:r>
+        <w:rPr>
+          <w:rFonts w:ascii="Times New Roman" w:hAnsi="Times New Roman"/>
+          <w:sz w:val="24"/>
+        </w:rPr>
+        <w:t>.</w:t>
+      </w:r>
+    </w:p>
+    <w:p>
+      <w:pPr>
+        <w:spacing w:after="120"/>
+        <w:rPr>
+          <w:lang w:val="ru-MD"/>
+        </w:rPr>
+      </w:pPr>
+      <w:r>
+        <w:rPr>
+          <w:rFonts w:ascii="Times New Roman" w:hAnsi="Times New Roman"/>
+          <w:sz w:val="24"/>
+          <w:lang w:val="ru-MD"/>
         </w:rPr>
         <w:t>На них гніздя́ться пти́ці;* бу́сли – на кипари́сах ї́хнє житло́.</w:t>
       </w:r>
@@ -678,11 +2126,15 @@
     <w:p>
       <w:pPr>
         <w:spacing w:after="120"/>
-      </w:pPr>
-      <w:r>
-        <w:rPr>
-          <w:rFonts w:ascii="Times New Roman" w:hAnsi="Times New Roman"/>
-          <w:sz w:val="24"/>
+        <w:rPr>
+          <w:lang w:val="ru-MD"/>
+        </w:rPr>
+      </w:pPr>
+      <w:r>
+        <w:rPr>
+          <w:rFonts w:ascii="Times New Roman" w:hAnsi="Times New Roman"/>
+          <w:sz w:val="24"/>
+          <w:lang w:val="ru-MD"/>
         </w:rPr>
         <w:t>Висо́кі го́ри для о́ленів,* ске́лі − для за́йців приту́лок.</w:t>
       </w:r>
@@ -690,11 +2142,15 @@
     <w:p>
       <w:pPr>
         <w:spacing w:after="120"/>
-      </w:pPr>
-      <w:r>
-        <w:rPr>
-          <w:rFonts w:ascii="Times New Roman" w:hAnsi="Times New Roman"/>
-          <w:sz w:val="24"/>
+        <w:rPr>
+          <w:lang w:val="ru-MD"/>
+        </w:rPr>
+      </w:pPr>
+      <w:r>
+        <w:rPr>
+          <w:rFonts w:ascii="Times New Roman" w:hAnsi="Times New Roman"/>
+          <w:sz w:val="24"/>
+          <w:lang w:val="ru-MD"/>
         </w:rPr>
         <w:t>Ти створи́в мі́сяць, щоб значи́ти по́ри;* со́нце зна́є свій за́хід.</w:t>
       </w:r>
@@ -702,11 +2158,15 @@
     <w:p>
       <w:pPr>
         <w:spacing w:after="120"/>
-      </w:pPr>
-      <w:r>
-        <w:rPr>
-          <w:rFonts w:ascii="Times New Roman" w:hAnsi="Times New Roman"/>
-          <w:sz w:val="24"/>
+        <w:rPr>
+          <w:lang w:val="ru-MD"/>
+        </w:rPr>
+      </w:pPr>
+      <w:r>
+        <w:rPr>
+          <w:rFonts w:ascii="Times New Roman" w:hAnsi="Times New Roman"/>
+          <w:sz w:val="24"/>
+          <w:lang w:val="ru-MD"/>
         </w:rPr>
         <w:t>Наво́диш те́мряву, і ніч надхо́дить,* що в ній вору́шаться усі́ зві́рі дібро́вні.</w:t>
       </w:r>
@@ -714,11 +2174,15 @@
     <w:p>
       <w:pPr>
         <w:spacing w:after="120"/>
-      </w:pPr>
-      <w:r>
-        <w:rPr>
-          <w:rFonts w:ascii="Times New Roman" w:hAnsi="Times New Roman"/>
-          <w:sz w:val="24"/>
+        <w:rPr>
+          <w:lang w:val="ru-MD"/>
+        </w:rPr>
+      </w:pPr>
+      <w:r>
+        <w:rPr>
+          <w:rFonts w:ascii="Times New Roman" w:hAnsi="Times New Roman"/>
+          <w:sz w:val="24"/>
+          <w:lang w:val="ru-MD"/>
         </w:rPr>
         <w:t>Левеня́та рика́ють за здо́биччю своє́ю,* пожи́ви від Бо́га для се́бе про́сять.</w:t>
       </w:r>
@@ -726,11 +2190,15 @@
     <w:p>
       <w:pPr>
         <w:spacing w:after="120"/>
-      </w:pPr>
-      <w:r>
-        <w:rPr>
-          <w:rFonts w:ascii="Times New Roman" w:hAnsi="Times New Roman"/>
-          <w:sz w:val="24"/>
+        <w:rPr>
+          <w:lang w:val="ru-MD"/>
+        </w:rPr>
+      </w:pPr>
+      <w:r>
+        <w:rPr>
+          <w:rFonts w:ascii="Times New Roman" w:hAnsi="Times New Roman"/>
+          <w:sz w:val="24"/>
+          <w:lang w:val="ru-MD"/>
         </w:rPr>
         <w:t>Хова́ються, як ті́льки зі́йде со́нце,* ляга́ють у свої́х но́рах.</w:t>
       </w:r>
@@ -738,11 +2206,15 @@
     <w:p>
       <w:pPr>
         <w:spacing w:after="120"/>
-      </w:pPr>
-      <w:r>
-        <w:rPr>
-          <w:rFonts w:ascii="Times New Roman" w:hAnsi="Times New Roman"/>
-          <w:sz w:val="24"/>
+        <w:rPr>
+          <w:lang w:val="ru-MD"/>
+        </w:rPr>
+      </w:pPr>
+      <w:r>
+        <w:rPr>
+          <w:rFonts w:ascii="Times New Roman" w:hAnsi="Times New Roman"/>
+          <w:sz w:val="24"/>
+          <w:lang w:val="ru-MD"/>
         </w:rPr>
         <w:t>Вихо́дить люди́на до свого́ ді́ла,* і до своє́ї пра́ці аж до ве́чора.</w:t>
       </w:r>
@@ -750,11 +2222,15 @@
     <w:p>
       <w:pPr>
         <w:spacing w:after="120"/>
-      </w:pPr>
-      <w:r>
-        <w:rPr>
-          <w:rFonts w:ascii="Times New Roman" w:hAnsi="Times New Roman"/>
-          <w:sz w:val="24"/>
+        <w:rPr>
+          <w:lang w:val="ru-MD"/>
+        </w:rPr>
+      </w:pPr>
+      <w:r>
+        <w:rPr>
+          <w:rFonts w:ascii="Times New Roman" w:hAnsi="Times New Roman"/>
+          <w:sz w:val="24"/>
+          <w:lang w:val="ru-MD"/>
         </w:rPr>
         <w:t>Яка́ їх, Твої́х діл, Го́споди, си́ла!* У му́дрості все Ти створи́в, − по́вна земля́ Твої́х створі́нь.</w:t>
       </w:r>
@@ -762,11 +2238,15 @@
     <w:p>
       <w:pPr>
         <w:spacing w:after="120"/>
-      </w:pPr>
-      <w:r>
-        <w:rPr>
-          <w:rFonts w:ascii="Times New Roman" w:hAnsi="Times New Roman"/>
-          <w:sz w:val="24"/>
+        <w:rPr>
+          <w:lang w:val="ru-MD"/>
+        </w:rPr>
+      </w:pPr>
+      <w:r>
+        <w:rPr>
+          <w:rFonts w:ascii="Times New Roman" w:hAnsi="Times New Roman"/>
+          <w:sz w:val="24"/>
+          <w:lang w:val="ru-MD"/>
         </w:rPr>
         <w:t>Ось мо́ре вели́ке, преширо́ке,* у ньо́му плазуні́в без лі́ку, зві́рів мали́х і вели́ких.</w:t>
       </w:r>
@@ -774,11 +2254,15 @@
     <w:p>
       <w:pPr>
         <w:spacing w:after="120"/>
-      </w:pPr>
-      <w:r>
-        <w:rPr>
-          <w:rFonts w:ascii="Times New Roman" w:hAnsi="Times New Roman"/>
-          <w:sz w:val="24"/>
+        <w:rPr>
+          <w:lang w:val="ru-MD"/>
+        </w:rPr>
+      </w:pPr>
+      <w:r>
+        <w:rPr>
+          <w:rFonts w:ascii="Times New Roman" w:hAnsi="Times New Roman"/>
+          <w:sz w:val="24"/>
+          <w:lang w:val="ru-MD"/>
         </w:rPr>
         <w:t>Там кораблі́ прохо́дять,* є і левіята́н, яко́го Ти створи́в, щоб ним ба́витися.</w:t>
       </w:r>
@@ -786,11 +2270,15 @@
     <w:p>
       <w:pPr>
         <w:spacing w:after="120"/>
-      </w:pPr>
-      <w:r>
-        <w:rPr>
-          <w:rFonts w:ascii="Times New Roman" w:hAnsi="Times New Roman"/>
-          <w:sz w:val="24"/>
+        <w:rPr>
+          <w:lang w:val="ru-MD"/>
+        </w:rPr>
+      </w:pPr>
+      <w:r>
+        <w:rPr>
+          <w:rFonts w:ascii="Times New Roman" w:hAnsi="Times New Roman"/>
+          <w:sz w:val="24"/>
+          <w:lang w:val="ru-MD"/>
         </w:rPr>
         <w:t>Усі́ вони́ від Те́бе дожида́ють,* щоб дав їм у свій час пожи́ву.</w:t>
       </w:r>
@@ -798,11 +2286,15 @@
     <w:p>
       <w:pPr>
         <w:spacing w:after="120"/>
-      </w:pPr>
-      <w:r>
-        <w:rPr>
-          <w:rFonts w:ascii="Times New Roman" w:hAnsi="Times New Roman"/>
-          <w:sz w:val="24"/>
+        <w:rPr>
+          <w:lang w:val="ru-MD"/>
+        </w:rPr>
+      </w:pPr>
+      <w:r>
+        <w:rPr>
+          <w:rFonts w:ascii="Times New Roman" w:hAnsi="Times New Roman"/>
+          <w:sz w:val="24"/>
+          <w:lang w:val="ru-MD"/>
         </w:rPr>
         <w:t>Коли́ дає́ш їм, вони́ її́ збира́ють,* як розту́люєш Твою́ ру́ку, вони́ наси́чуються бла́гом.</w:t>
       </w:r>
@@ -810,11 +2302,15 @@
     <w:p>
       <w:pPr>
         <w:spacing w:after="120"/>
-      </w:pPr>
-      <w:r>
-        <w:rPr>
-          <w:rFonts w:ascii="Times New Roman" w:hAnsi="Times New Roman"/>
-          <w:sz w:val="24"/>
+        <w:rPr>
+          <w:lang w:val="ru-MD"/>
+        </w:rPr>
+      </w:pPr>
+      <w:r>
+        <w:rPr>
+          <w:rFonts w:ascii="Times New Roman" w:hAnsi="Times New Roman"/>
+          <w:sz w:val="24"/>
+          <w:lang w:val="ru-MD"/>
         </w:rPr>
         <w:t>Вони́ бенте́жаться, коли́ хова́єш вид Свій;* як забира́єш дух у них, вони́ ги́нуть і поверта́ються у свій по́рох.</w:t>
       </w:r>
@@ -822,11 +2318,15 @@
     <w:p>
       <w:pPr>
         <w:spacing w:after="120"/>
-      </w:pPr>
-      <w:r>
-        <w:rPr>
-          <w:rFonts w:ascii="Times New Roman" w:hAnsi="Times New Roman"/>
-          <w:sz w:val="24"/>
+        <w:rPr>
+          <w:lang w:val="ru-MD"/>
+        </w:rPr>
+      </w:pPr>
+      <w:r>
+        <w:rPr>
+          <w:rFonts w:ascii="Times New Roman" w:hAnsi="Times New Roman"/>
+          <w:sz w:val="24"/>
+          <w:lang w:val="ru-MD"/>
         </w:rPr>
         <w:t>Зішле́ш Свій дух, – вони́ ожива́ють,* і Ти відно́влюєш лице́ землі́.</w:t>
       </w:r>
@@ -834,11 +2334,15 @@
     <w:p>
       <w:pPr>
         <w:spacing w:after="120"/>
-      </w:pPr>
-      <w:r>
-        <w:rPr>
-          <w:rFonts w:ascii="Times New Roman" w:hAnsi="Times New Roman"/>
-          <w:sz w:val="24"/>
+        <w:rPr>
+          <w:lang w:val="ru-MD"/>
+        </w:rPr>
+      </w:pPr>
+      <w:r>
+        <w:rPr>
+          <w:rFonts w:ascii="Times New Roman" w:hAnsi="Times New Roman"/>
+          <w:sz w:val="24"/>
+          <w:lang w:val="ru-MD"/>
         </w:rPr>
         <w:t>Неха́й сла́ва Госпо́дня бу́де пові́ки,* неха́й Госпо́дь раді́є тво́рами Свої́ми.</w:t>
       </w:r>
@@ -846,11 +2350,15 @@
     <w:p>
       <w:pPr>
         <w:spacing w:after="120"/>
-      </w:pPr>
-      <w:r>
-        <w:rPr>
-          <w:rFonts w:ascii="Times New Roman" w:hAnsi="Times New Roman"/>
-          <w:sz w:val="24"/>
+        <w:rPr>
+          <w:lang w:val="ru-MD"/>
+        </w:rPr>
+      </w:pPr>
+      <w:r>
+        <w:rPr>
+          <w:rFonts w:ascii="Times New Roman" w:hAnsi="Times New Roman"/>
+          <w:sz w:val="24"/>
+          <w:lang w:val="ru-MD"/>
         </w:rPr>
         <w:t>Спогля́не Він на зе́млю, і вона́ стряса́ється,* торкне́ться гір, вони́ диму́ють.</w:t>
       </w:r>
@@ -858,11 +2366,15 @@
     <w:p>
       <w:pPr>
         <w:spacing w:after="120"/>
-      </w:pPr>
-      <w:r>
-        <w:rPr>
-          <w:rFonts w:ascii="Times New Roman" w:hAnsi="Times New Roman"/>
-          <w:sz w:val="24"/>
+        <w:rPr>
+          <w:lang w:val="ru-MD"/>
+        </w:rPr>
+      </w:pPr>
+      <w:r>
+        <w:rPr>
+          <w:rFonts w:ascii="Times New Roman" w:hAnsi="Times New Roman"/>
+          <w:sz w:val="24"/>
+          <w:lang w:val="ru-MD"/>
         </w:rPr>
         <w:t>Я бу́ду Го́сподеві спі́вати по́ки життя́ мого́,* псалми́ співа́тиму, по́ки бу́ду жи́ти.</w:t>
       </w:r>
@@ -870,11 +2382,15 @@
     <w:p>
       <w:pPr>
         <w:spacing w:after="120"/>
-      </w:pPr>
-      <w:r>
-        <w:rPr>
-          <w:rFonts w:ascii="Times New Roman" w:hAnsi="Times New Roman"/>
-          <w:sz w:val="24"/>
+        <w:rPr>
+          <w:lang w:val="ru-MD"/>
+        </w:rPr>
+      </w:pPr>
+      <w:r>
+        <w:rPr>
+          <w:rFonts w:ascii="Times New Roman" w:hAnsi="Times New Roman"/>
+          <w:sz w:val="24"/>
+          <w:lang w:val="ru-MD"/>
         </w:rPr>
         <w:t>Неха́й бу́де приє́мна Йому́ моя́ пі́сня;* у Го́споді я весели́тимусь.</w:t>
       </w:r>
@@ -882,11 +2398,15 @@
     <w:p>
       <w:pPr>
         <w:spacing w:after="120"/>
-      </w:pPr>
-      <w:r>
-        <w:rPr>
-          <w:rFonts w:ascii="Times New Roman" w:hAnsi="Times New Roman"/>
-          <w:sz w:val="24"/>
+        <w:rPr>
+          <w:lang w:val="ru-MD"/>
+        </w:rPr>
+      </w:pPr>
+      <w:r>
+        <w:rPr>
+          <w:rFonts w:ascii="Times New Roman" w:hAnsi="Times New Roman"/>
+          <w:sz w:val="24"/>
+          <w:lang w:val="ru-MD"/>
         </w:rPr>
         <w:t>Неха́й грі́шники з землі ще́знуть, і беззако́нних бі́льше неха́й не бу́де.* Благослови́, душе́ моя́, Го́спода.</w:t>
       </w:r>
@@ -894,11 +2414,15 @@
     <w:p>
       <w:pPr>
         <w:spacing w:after="120"/>
-      </w:pPr>
-      <w:r>
-        <w:rPr>
-          <w:rFonts w:ascii="Times New Roman" w:hAnsi="Times New Roman"/>
-          <w:sz w:val="24"/>
+        <w:rPr>
+          <w:lang w:val="ru-MD"/>
+        </w:rPr>
+      </w:pPr>
+      <w:r>
+        <w:rPr>
+          <w:rFonts w:ascii="Times New Roman" w:hAnsi="Times New Roman"/>
+          <w:sz w:val="24"/>
+          <w:lang w:val="ru-MD"/>
         </w:rPr>
         <w:t>Со́нце зна́є свій за́хід,* наво́диш те́мряву, і ніч надхо́дить.</w:t>
       </w:r>
@@ -906,11 +2430,15 @@
     <w:p>
       <w:pPr>
         <w:spacing w:after="120"/>
-      </w:pPr>
-      <w:r>
-        <w:rPr>
-          <w:rFonts w:ascii="Times New Roman" w:hAnsi="Times New Roman"/>
-          <w:sz w:val="24"/>
+        <w:rPr>
+          <w:lang w:val="ru-MD"/>
+        </w:rPr>
+      </w:pPr>
+      <w:r>
+        <w:rPr>
+          <w:rFonts w:ascii="Times New Roman" w:hAnsi="Times New Roman"/>
+          <w:sz w:val="24"/>
+          <w:lang w:val="ru-MD"/>
         </w:rPr>
         <w:t>Яка́ їх, Твої́х діл, Го́споди, си́ла!* У му́дрості все Ти створи́в.</w:t>
       </w:r>
@@ -918,11 +2446,15 @@
     <w:p>
       <w:pPr>
         <w:spacing w:after="120"/>
-      </w:pPr>
-      <w:r>
-        <w:rPr>
-          <w:rFonts w:ascii="Times New Roman" w:hAnsi="Times New Roman"/>
-          <w:sz w:val="24"/>
+        <w:rPr>
+          <w:lang w:val="ru-MD"/>
+        </w:rPr>
+      </w:pPr>
+      <w:r>
+        <w:rPr>
+          <w:rFonts w:ascii="Times New Roman" w:hAnsi="Times New Roman"/>
+          <w:sz w:val="24"/>
+          <w:lang w:val="ru-MD"/>
         </w:rPr>
         <w:t>Сла́ва Отцю́, і Си́ну, і Свято́му Ду́хові,* І ни́ні, і повсякча́с, і на ві́ки вікі́в. Амі́нь.</w:t>
       </w:r>
@@ -930,11 +2462,15 @@
     <w:p>
       <w:pPr>
         <w:spacing w:after="120"/>
-      </w:pPr>
-      <w:r>
-        <w:rPr>
-          <w:rFonts w:ascii="Times New Roman" w:hAnsi="Times New Roman"/>
-          <w:sz w:val="24"/>
+        <w:rPr>
+          <w:lang w:val="ru-MD"/>
+        </w:rPr>
+      </w:pPr>
+      <w:r>
+        <w:rPr>
+          <w:rFonts w:ascii="Times New Roman" w:hAnsi="Times New Roman"/>
+          <w:sz w:val="24"/>
+          <w:lang w:val="ru-MD"/>
         </w:rPr>
         <w:t xml:space="preserve">Алилу́я, алилу́я, алилу́я, сла́ва Тобі́, Бо́же. </w:t>
       </w:r>
@@ -944,6 +2480,7 @@
           <w:i/>
           <w:color w:val="FF0000"/>
           <w:sz w:val="24"/>
+          <w:lang w:val="ru-MD"/>
         </w:rPr>
         <w:t>(3 р.)</w:t>
       </w:r>
@@ -1200,6 +2737,7 @@
           <w:rFonts w:ascii="Times New Roman" w:eastAsia="Gungsuh" w:hAnsi="Times New Roman" w:cs="Gungsuh"/>
           <w:sz w:val="24"/>
           <w:szCs w:val="24"/>
+          <w:lang w:val="ru-MD"/>
         </w:rPr>
         <w:t xml:space="preserve"> </w:t>
       </w:r>
@@ -3453,11 +4991,15 @@
     <w:p>
       <w:pPr>
         <w:spacing w:after="120"/>
-      </w:pPr>
-      <w:r>
-        <w:rPr>
-          <w:rFonts w:ascii="Times New Roman" w:hAnsi="Times New Roman"/>
-          <w:sz w:val="24"/>
+        <w:rPr>
+          <w:lang w:val="ru-MD"/>
+        </w:rPr>
+      </w:pPr>
+      <w:r>
+        <w:rPr>
+          <w:rFonts w:ascii="Times New Roman" w:hAnsi="Times New Roman"/>
+          <w:sz w:val="24"/>
+          <w:lang w:val="ru-MD"/>
         </w:rPr>
         <w:t>Поста́в, Го́споди, мої́м уста́м сторо́жу;* до двере́й губ мої́х − ва́рту!</w:t>
       </w:r>
@@ -3465,11 +5007,15 @@
     <w:p>
       <w:pPr>
         <w:spacing w:after="120"/>
-      </w:pPr>
-      <w:r>
-        <w:rPr>
-          <w:rFonts w:ascii="Times New Roman" w:hAnsi="Times New Roman"/>
-          <w:sz w:val="24"/>
+        <w:rPr>
+          <w:lang w:val="ru-MD"/>
+        </w:rPr>
+      </w:pPr>
+      <w:r>
+        <w:rPr>
+          <w:rFonts w:ascii="Times New Roman" w:hAnsi="Times New Roman"/>
+          <w:sz w:val="24"/>
+          <w:lang w:val="ru-MD"/>
         </w:rPr>
         <w:t>Не дай схили́тися се́рцеві моє́му* до чо́гось зло́го.</w:t>
       </w:r>
@@ -3477,11 +5023,15 @@
     <w:p>
       <w:pPr>
         <w:spacing w:after="120"/>
-      </w:pPr>
-      <w:r>
-        <w:rPr>
-          <w:rFonts w:ascii="Times New Roman" w:hAnsi="Times New Roman"/>
-          <w:sz w:val="24"/>
+        <w:rPr>
+          <w:lang w:val="ru-MD"/>
+        </w:rPr>
+      </w:pPr>
+      <w:r>
+        <w:rPr>
+          <w:rFonts w:ascii="Times New Roman" w:hAnsi="Times New Roman"/>
+          <w:sz w:val="24"/>
+          <w:lang w:val="ru-MD"/>
         </w:rPr>
         <w:t>Ані чини́ти лихі́ вчи́нки з людьми́, що тво́рять беззако́ння,* – ні ла́сощів ї́хніх я не хо́чу ї́сти.</w:t>
       </w:r>
@@ -3489,11 +5039,15 @@
     <w:p>
       <w:pPr>
         <w:spacing w:after="120"/>
-      </w:pPr>
-      <w:r>
-        <w:rPr>
-          <w:rFonts w:ascii="Times New Roman" w:hAnsi="Times New Roman"/>
-          <w:sz w:val="24"/>
+        <w:rPr>
+          <w:lang w:val="ru-MD"/>
+        </w:rPr>
+      </w:pPr>
+      <w:r>
+        <w:rPr>
+          <w:rFonts w:ascii="Times New Roman" w:hAnsi="Times New Roman"/>
+          <w:sz w:val="24"/>
+          <w:lang w:val="ru-MD"/>
         </w:rPr>
         <w:t>Неха́й пра́ведник по-до́брому б’є мене́ й виправля́є,* а олі́я грі́шного неха́й не нама́стить голови́ моє́ї.</w:t>
       </w:r>
@@ -3501,11 +5055,15 @@
     <w:p>
       <w:pPr>
         <w:spacing w:after="120"/>
-      </w:pPr>
-      <w:r>
-        <w:rPr>
-          <w:rFonts w:ascii="Times New Roman" w:hAnsi="Times New Roman"/>
-          <w:sz w:val="24"/>
+        <w:rPr>
+          <w:lang w:val="ru-MD"/>
+        </w:rPr>
+      </w:pPr>
+      <w:r>
+        <w:rPr>
+          <w:rFonts w:ascii="Times New Roman" w:hAnsi="Times New Roman"/>
+          <w:sz w:val="24"/>
+          <w:lang w:val="ru-MD"/>
         </w:rPr>
         <w:t>Я все-таки́ моли́тимусь,* незважа́ючи на ї́хні злі вчи́нки.</w:t>
       </w:r>
@@ -3513,11 +5071,15 @@
     <w:p>
       <w:pPr>
         <w:spacing w:after="120"/>
-      </w:pPr>
-      <w:r>
-        <w:rPr>
-          <w:rFonts w:ascii="Times New Roman" w:hAnsi="Times New Roman"/>
-          <w:sz w:val="24"/>
+        <w:rPr>
+          <w:lang w:val="ru-MD"/>
+        </w:rPr>
+      </w:pPr>
+      <w:r>
+        <w:rPr>
+          <w:rFonts w:ascii="Times New Roman" w:hAnsi="Times New Roman"/>
+          <w:sz w:val="24"/>
+          <w:lang w:val="ru-MD"/>
         </w:rPr>
         <w:t>Якщо́ су́ддів ї́хніх ски́нуть в уще́лини ске́лі,* то почу́ють, що слова́ мої́ лю́бі.</w:t>
       </w:r>
@@ -3525,11 +5087,15 @@
     <w:p>
       <w:pPr>
         <w:spacing w:after="120"/>
-      </w:pPr>
-      <w:r>
-        <w:rPr>
-          <w:rFonts w:ascii="Times New Roman" w:hAnsi="Times New Roman"/>
-          <w:sz w:val="24"/>
+        <w:rPr>
+          <w:lang w:val="ru-MD"/>
+        </w:rPr>
+      </w:pPr>
+      <w:r>
+        <w:rPr>
+          <w:rFonts w:ascii="Times New Roman" w:hAnsi="Times New Roman"/>
+          <w:sz w:val="24"/>
+          <w:lang w:val="ru-MD"/>
         </w:rPr>
         <w:t>Немо́вби хтось розби́в і розри́в зе́млю,* розки́дано ї́хні ко́сті пе́ред а́дом.</w:t>
       </w:r>
@@ -3537,11 +5103,15 @@
     <w:p>
       <w:pPr>
         <w:spacing w:after="120"/>
-      </w:pPr>
-      <w:r>
-        <w:rPr>
-          <w:rFonts w:ascii="Times New Roman" w:hAnsi="Times New Roman"/>
-          <w:sz w:val="24"/>
+        <w:rPr>
+          <w:lang w:val="ru-MD"/>
+        </w:rPr>
+      </w:pPr>
+      <w:r>
+        <w:rPr>
+          <w:rFonts w:ascii="Times New Roman" w:hAnsi="Times New Roman"/>
+          <w:sz w:val="24"/>
+          <w:lang w:val="ru-MD"/>
         </w:rPr>
         <w:t>Бо до Те́бе, Го́споди, мій Бо́же, мої́ о́чі;* до Те́бе прибіга́ю, не губи́ душі́ моє́ї.</w:t>
       </w:r>
@@ -3549,11 +5119,15 @@
     <w:p>
       <w:pPr>
         <w:spacing w:after="120"/>
-      </w:pPr>
-      <w:r>
-        <w:rPr>
-          <w:rFonts w:ascii="Times New Roman" w:hAnsi="Times New Roman"/>
-          <w:sz w:val="24"/>
+        <w:rPr>
+          <w:lang w:val="ru-MD"/>
+        </w:rPr>
+      </w:pPr>
+      <w:r>
+        <w:rPr>
+          <w:rFonts w:ascii="Times New Roman" w:hAnsi="Times New Roman"/>
+          <w:sz w:val="24"/>
+          <w:lang w:val="ru-MD"/>
         </w:rPr>
         <w:t>Збережи́ мене́ від пе́тлі, що її́ наста́вили на ме́не,* і від сильця́ тих, що тво́рять беззако́ння.</w:t>
       </w:r>
@@ -3561,11 +5135,15 @@
     <w:p>
       <w:pPr>
         <w:spacing w:after="120"/>
-      </w:pPr>
-      <w:r>
-        <w:rPr>
-          <w:rFonts w:ascii="Times New Roman" w:hAnsi="Times New Roman"/>
-          <w:sz w:val="24"/>
+        <w:rPr>
+          <w:lang w:val="ru-MD"/>
+        </w:rPr>
+      </w:pPr>
+      <w:r>
+        <w:rPr>
+          <w:rFonts w:ascii="Times New Roman" w:hAnsi="Times New Roman"/>
+          <w:sz w:val="24"/>
+          <w:lang w:val="ru-MD"/>
         </w:rPr>
         <w:t>Неха́й грі́шники впаду́ть у вла́сні сі́ті всі ра́зом,* а я пройду́ безпе́чно.</w:t>
       </w:r>
@@ -3573,6 +5151,9 @@
     <w:p>
       <w:pPr>
         <w:spacing w:after="120"/>
+        <w:rPr>
+          <w:lang w:val="ru-MD"/>
+        </w:rPr>
       </w:pPr>
       <w:r>
         <w:rPr>
@@ -3581,6 +5162,7 @@
           <w:i/>
           <w:color w:val="FF0000"/>
           <w:sz w:val="24"/>
+          <w:lang w:val="ru-MD"/>
         </w:rPr>
         <w:t>Псалом 141</w:t>
       </w:r>
@@ -3588,11 +5170,15 @@
     <w:p>
       <w:pPr>
         <w:spacing w:after="120"/>
-      </w:pPr>
-      <w:r>
-        <w:rPr>
-          <w:rFonts w:ascii="Times New Roman" w:hAnsi="Times New Roman"/>
-          <w:sz w:val="24"/>
+        <w:rPr>
+          <w:lang w:val="ru-MD"/>
+        </w:rPr>
+      </w:pPr>
+      <w:r>
+        <w:rPr>
+          <w:rFonts w:ascii="Times New Roman" w:hAnsi="Times New Roman"/>
+          <w:sz w:val="24"/>
+          <w:lang w:val="ru-MD"/>
         </w:rPr>
         <w:t>Я го́лосом мої́м до Го́спода взива́ю,* я го́лосом мої́м до Го́спода молю́ся.</w:t>
       </w:r>
@@ -3600,11 +5186,15 @@
     <w:p>
       <w:pPr>
         <w:spacing w:after="120"/>
-      </w:pPr>
-      <w:r>
-        <w:rPr>
-          <w:rFonts w:ascii="Times New Roman" w:hAnsi="Times New Roman"/>
-          <w:sz w:val="24"/>
+        <w:rPr>
+          <w:lang w:val="ru-MD"/>
+        </w:rPr>
+      </w:pPr>
+      <w:r>
+        <w:rPr>
+          <w:rFonts w:ascii="Times New Roman" w:hAnsi="Times New Roman"/>
+          <w:sz w:val="24"/>
+          <w:lang w:val="ru-MD"/>
         </w:rPr>
         <w:t>Ска́ргу мою́ пе́ред Ним вилива́ю,* мою́ скру́ту Йому́ я виявля́ю.</w:t>
       </w:r>
@@ -3612,11 +5202,15 @@
     <w:p>
       <w:pPr>
         <w:spacing w:after="120"/>
-      </w:pPr>
-      <w:r>
-        <w:rPr>
-          <w:rFonts w:ascii="Times New Roman" w:hAnsi="Times New Roman"/>
-          <w:sz w:val="24"/>
+        <w:rPr>
+          <w:lang w:val="ru-MD"/>
+        </w:rPr>
+      </w:pPr>
+      <w:r>
+        <w:rPr>
+          <w:rFonts w:ascii="Times New Roman" w:hAnsi="Times New Roman"/>
+          <w:sz w:val="24"/>
+          <w:lang w:val="ru-MD"/>
         </w:rPr>
         <w:t>Коли́ триво́житься в мені́ дух мій, Ти знає́ш мою́ сте́жку.* На доро́зі, де я ступа́ю, та́йно розста́вили сильце́ на ме́не.</w:t>
       </w:r>
@@ -3624,11 +5218,15 @@
     <w:p>
       <w:pPr>
         <w:spacing w:after="120"/>
-      </w:pPr>
-      <w:r>
-        <w:rPr>
-          <w:rFonts w:ascii="Times New Roman" w:hAnsi="Times New Roman"/>
-          <w:sz w:val="24"/>
+        <w:rPr>
+          <w:lang w:val="ru-MD"/>
+        </w:rPr>
+      </w:pPr>
+      <w:r>
+        <w:rPr>
+          <w:rFonts w:ascii="Times New Roman" w:hAnsi="Times New Roman"/>
+          <w:sz w:val="24"/>
+          <w:lang w:val="ru-MD"/>
         </w:rPr>
         <w:t>Погля́нь право́руч і подиви́ся:* нема́ ніко́го, хто дбав би за ме́не.</w:t>
       </w:r>
@@ -3636,11 +5234,15 @@
     <w:p>
       <w:pPr>
         <w:spacing w:after="120"/>
-      </w:pPr>
-      <w:r>
-        <w:rPr>
-          <w:rFonts w:ascii="Times New Roman" w:hAnsi="Times New Roman"/>
-          <w:sz w:val="24"/>
+        <w:rPr>
+          <w:lang w:val="ru-MD"/>
+        </w:rPr>
+      </w:pPr>
+      <w:r>
+        <w:rPr>
+          <w:rFonts w:ascii="Times New Roman" w:hAnsi="Times New Roman"/>
+          <w:sz w:val="24"/>
+          <w:lang w:val="ru-MD"/>
         </w:rPr>
         <w:t>Нема́ куди́ мені́ втіка́ти,* нема́ ніко́го, хто піклува́вся би мно́ю.</w:t>
       </w:r>
@@ -3648,11 +5250,15 @@
     <w:p>
       <w:pPr>
         <w:spacing w:after="120"/>
-      </w:pPr>
-      <w:r>
-        <w:rPr>
-          <w:rFonts w:ascii="Times New Roman" w:hAnsi="Times New Roman"/>
-          <w:sz w:val="24"/>
+        <w:rPr>
+          <w:lang w:val="ru-MD"/>
+        </w:rPr>
+      </w:pPr>
+      <w:r>
+        <w:rPr>
+          <w:rFonts w:ascii="Times New Roman" w:hAnsi="Times New Roman"/>
+          <w:sz w:val="24"/>
+          <w:lang w:val="ru-MD"/>
         </w:rPr>
         <w:t>До Те́бе, Го́споди, взива́ю й кажу́:* Ти моє́ прибі́жище, в землі́ живи́х Ти − моя́ до́ля!</w:t>
       </w:r>
@@ -3660,11 +5266,15 @@
     <w:p>
       <w:pPr>
         <w:spacing w:after="120"/>
-      </w:pPr>
-      <w:r>
-        <w:rPr>
-          <w:rFonts w:ascii="Times New Roman" w:hAnsi="Times New Roman"/>
-          <w:sz w:val="24"/>
+        <w:rPr>
+          <w:lang w:val="ru-MD"/>
+        </w:rPr>
+      </w:pPr>
+      <w:r>
+        <w:rPr>
+          <w:rFonts w:ascii="Times New Roman" w:hAnsi="Times New Roman"/>
+          <w:sz w:val="24"/>
+          <w:lang w:val="ru-MD"/>
         </w:rPr>
         <w:t>Зверни́ ува́гу на моє́ блага́ння,* бо я ве́льми неща́сний.</w:t>
       </w:r>
@@ -3672,11 +5282,15 @@
     <w:p>
       <w:pPr>
         <w:spacing w:after="120"/>
-      </w:pPr>
-      <w:r>
-        <w:rPr>
-          <w:rFonts w:ascii="Times New Roman" w:hAnsi="Times New Roman"/>
-          <w:sz w:val="24"/>
+        <w:rPr>
+          <w:lang w:val="ru-MD"/>
+        </w:rPr>
+      </w:pPr>
+      <w:r>
+        <w:rPr>
+          <w:rFonts w:ascii="Times New Roman" w:hAnsi="Times New Roman"/>
+          <w:sz w:val="24"/>
+          <w:lang w:val="ru-MD"/>
         </w:rPr>
         <w:t>Спаси́ мене́ від гони́телів мої́х,* бо вони́ сильні́ші від ме́не.</w:t>
       </w:r>
@@ -6481,15 +8095,18 @@
     </w:p>
     <w:p>
       <w:pPr>
-        <w:pStyle w:val="Normal"/>
-        <w:spacing w:after="120"/>
-      </w:pPr>
-      <w:r>
-        <w:rPr>
-          <w:rFonts w:ascii="Times New Roman" w:hAnsi="Times New Roman"/>
-          <w:i/>
-          <w:color w:val="FF0000"/>
-          <w:sz w:val="24"/>
+        <w:spacing w:after="120"/>
+        <w:rPr>
+          <w:lang w:val="ru-MD"/>
+        </w:rPr>
+      </w:pPr>
+      <w:r>
+        <w:rPr>
+          <w:rFonts w:ascii="Times New Roman" w:hAnsi="Times New Roman"/>
+          <w:i/>
+          <w:color w:val="FF0000"/>
+          <w:sz w:val="24"/>
+          <w:lang w:val="ru-MD"/>
         </w:rPr>
         <w:t>Священик:</w:t>
       </w:r>
@@ -6498,6 +8115,7 @@
           <w:rFonts w:ascii="Times New Roman" w:hAnsi="Times New Roman"/>
           <w:color w:val="FF0000"/>
           <w:sz w:val="24"/>
+          <w:lang w:val="ru-MD"/>
         </w:rPr>
         <w:t xml:space="preserve"> </w:t>
       </w:r>
@@ -6506,344 +8124,18 @@
           <w:rFonts w:ascii="Times New Roman" w:hAnsi="Times New Roman"/>
           <w:color w:val="000000"/>
           <w:sz w:val="24"/>
-        </w:rPr>
-        <w:t>Нехай</w:t>
+          <w:lang w:val="ru-MD"/>
+        </w:rPr>
+        <w:t>Нехай буде влада царства Твого благословенна і дуже прославлена: Отця, і Сина, і Святого Дух</w:t>
       </w:r>
       <w:r>
         <w:rPr>
           <w:rFonts w:ascii="Times New Roman" w:hAnsi="Times New Roman"/>
           <w:color w:val="000000"/>
           <w:sz w:val="24"/>
-        </w:rPr>
-        <w:t xml:space="preserve"> </w:t>
-      </w:r>
-      <w:r>
-        <w:rPr>
-          <w:rFonts w:ascii="Times New Roman" w:hAnsi="Times New Roman"/>
-          <w:color w:val="000000"/>
-          <w:sz w:val="24"/>
-        </w:rPr>
-        <w:t>буде</w:t>
-      </w:r>
-      <w:r>
-        <w:rPr>
-          <w:rFonts w:ascii="Times New Roman" w:hAnsi="Times New Roman"/>
-          <w:color w:val="000000"/>
-          <w:sz w:val="24"/>
-        </w:rPr>
-        <w:t xml:space="preserve"> </w:t>
-      </w:r>
-      <w:r>
-        <w:rPr>
-          <w:rFonts w:ascii="Times New Roman" w:hAnsi="Times New Roman"/>
-          <w:color w:val="000000"/>
-          <w:sz w:val="24"/>
-        </w:rPr>
-        <w:t>влада</w:t>
-      </w:r>
-      <w:r>
-        <w:rPr>
-          <w:rFonts w:ascii="Times New Roman" w:hAnsi="Times New Roman"/>
-          <w:color w:val="000000"/>
-          <w:sz w:val="24"/>
-        </w:rPr>
-        <w:t xml:space="preserve"> </w:t>
-      </w:r>
-      <w:r>
-        <w:rPr>
-          <w:rFonts w:ascii="Times New Roman" w:hAnsi="Times New Roman"/>
-          <w:color w:val="000000"/>
-          <w:sz w:val="24"/>
-        </w:rPr>
-        <w:t>царства</w:t>
-      </w:r>
-      <w:r>
-        <w:rPr>
-          <w:rFonts w:ascii="Times New Roman" w:hAnsi="Times New Roman"/>
-          <w:color w:val="000000"/>
-          <w:sz w:val="24"/>
-        </w:rPr>
-        <w:t xml:space="preserve"> </w:t>
-      </w:r>
-      <w:r>
-        <w:rPr>
-          <w:rFonts w:ascii="Times New Roman" w:hAnsi="Times New Roman"/>
-          <w:color w:val="000000"/>
-          <w:sz w:val="24"/>
-        </w:rPr>
-        <w:t>Твого</w:t>
-      </w:r>
-      <w:r>
-        <w:rPr>
-          <w:rFonts w:ascii="Times New Roman" w:hAnsi="Times New Roman"/>
-          <w:color w:val="000000"/>
-          <w:sz w:val="24"/>
-        </w:rPr>
-        <w:t xml:space="preserve"> </w:t>
-      </w:r>
-      <w:r>
-        <w:rPr>
-          <w:rFonts w:ascii="Times New Roman" w:hAnsi="Times New Roman"/>
-          <w:color w:val="000000"/>
-          <w:sz w:val="24"/>
-        </w:rPr>
-        <w:t>благословенна</w:t>
-      </w:r>
-      <w:r>
-        <w:rPr>
-          <w:rFonts w:ascii="Times New Roman" w:hAnsi="Times New Roman"/>
-          <w:color w:val="000000"/>
-          <w:sz w:val="24"/>
-        </w:rPr>
-        <w:t xml:space="preserve"> </w:t>
-      </w:r>
-      <w:r>
-        <w:rPr>
-          <w:rFonts w:ascii="Times New Roman" w:hAnsi="Times New Roman"/>
-          <w:color w:val="000000"/>
-          <w:sz w:val="24"/>
-        </w:rPr>
-        <w:t>і</w:t>
-      </w:r>
-      <w:r>
-        <w:rPr>
-          <w:rFonts w:ascii="Times New Roman" w:hAnsi="Times New Roman"/>
-          <w:color w:val="000000"/>
-          <w:sz w:val="24"/>
-        </w:rPr>
-        <w:t xml:space="preserve"> </w:t>
-      </w:r>
-      <w:r>
-        <w:rPr>
-          <w:rFonts w:ascii="Times New Roman" w:hAnsi="Times New Roman"/>
-          <w:color w:val="000000"/>
-          <w:sz w:val="24"/>
-        </w:rPr>
-        <w:t>дуже</w:t>
-      </w:r>
-      <w:r>
-        <w:rPr>
-          <w:rFonts w:ascii="Times New Roman" w:hAnsi="Times New Roman"/>
-          <w:color w:val="000000"/>
-          <w:sz w:val="24"/>
-        </w:rPr>
-        <w:t xml:space="preserve"> </w:t>
-      </w:r>
-      <w:r>
-        <w:rPr>
-          <w:rFonts w:ascii="Times New Roman" w:hAnsi="Times New Roman"/>
-          <w:color w:val="000000"/>
-          <w:sz w:val="24"/>
-        </w:rPr>
-        <w:t>прославлена:</w:t>
-      </w:r>
-      <w:r>
-        <w:rPr>
-          <w:rFonts w:ascii="Times New Roman" w:hAnsi="Times New Roman"/>
-          <w:color w:val="000000"/>
-          <w:sz w:val="24"/>
-        </w:rPr>
-        <w:t xml:space="preserve"> </w:t>
-      </w:r>
-      <w:r>
-        <w:rPr>
-          <w:rFonts w:ascii="Times New Roman" w:hAnsi="Times New Roman"/>
-          <w:color w:val="000000"/>
-          <w:sz w:val="24"/>
-        </w:rPr>
-        <w:t>Отця,</w:t>
-      </w:r>
-      <w:r>
-        <w:rPr>
-          <w:rFonts w:ascii="Times New Roman" w:hAnsi="Times New Roman"/>
-          <w:color w:val="000000"/>
-          <w:sz w:val="24"/>
-        </w:rPr>
-        <w:t xml:space="preserve"> </w:t>
-      </w:r>
-      <w:r>
-        <w:rPr>
-          <w:rFonts w:ascii="Times New Roman" w:hAnsi="Times New Roman"/>
-          <w:color w:val="000000"/>
-          <w:sz w:val="24"/>
-        </w:rPr>
-        <w:t>і</w:t>
-      </w:r>
-      <w:r>
-        <w:rPr>
-          <w:rFonts w:ascii="Times New Roman" w:hAnsi="Times New Roman"/>
-          <w:color w:val="000000"/>
-          <w:sz w:val="24"/>
-        </w:rPr>
-        <w:t xml:space="preserve"> </w:t>
-      </w:r>
-      <w:r>
-        <w:rPr>
-          <w:rFonts w:ascii="Times New Roman" w:hAnsi="Times New Roman"/>
-          <w:color w:val="000000"/>
-          <w:sz w:val="24"/>
-        </w:rPr>
-        <w:t>Сина,</w:t>
-      </w:r>
-      <w:r>
-        <w:rPr>
-          <w:rFonts w:ascii="Times New Roman" w:hAnsi="Times New Roman"/>
-          <w:color w:val="000000"/>
-          <w:sz w:val="24"/>
-        </w:rPr>
-        <w:t xml:space="preserve"> </w:t>
-      </w:r>
-      <w:r>
-        <w:rPr>
-          <w:rFonts w:ascii="Times New Roman" w:hAnsi="Times New Roman"/>
-          <w:color w:val="000000"/>
-          <w:sz w:val="24"/>
-        </w:rPr>
-        <w:t>і</w:t>
-      </w:r>
-      <w:r>
-        <w:rPr>
-          <w:rFonts w:ascii="Times New Roman" w:hAnsi="Times New Roman"/>
-          <w:color w:val="000000"/>
-          <w:sz w:val="24"/>
-        </w:rPr>
-        <w:t xml:space="preserve"> </w:t>
-      </w:r>
-      <w:r>
-        <w:rPr>
-          <w:rFonts w:ascii="Times New Roman" w:hAnsi="Times New Roman"/>
-          <w:color w:val="000000"/>
-          <w:sz w:val="24"/>
-        </w:rPr>
-        <w:t>Святого</w:t>
-      </w:r>
-      <w:r>
-        <w:rPr>
-          <w:rFonts w:ascii="Times New Roman" w:hAnsi="Times New Roman"/>
-          <w:color w:val="000000"/>
-          <w:sz w:val="24"/>
-        </w:rPr>
-        <w:t xml:space="preserve"> </w:t>
-      </w:r>
-      <w:r>
-        <w:rPr>
-          <w:rFonts w:ascii="Times New Roman" w:hAnsi="Times New Roman"/>
-          <w:color w:val="000000"/>
-          <w:sz w:val="24"/>
-        </w:rPr>
-        <w:t>Духа,</w:t>
-      </w:r>
-      <w:r>
-        <w:rPr>
-          <w:rFonts w:ascii="Times New Roman" w:hAnsi="Times New Roman"/>
-          <w:color w:val="000000"/>
-          <w:sz w:val="24"/>
-        </w:rPr>
-        <w:t xml:space="preserve"> </w:t>
-      </w:r>
-      <w:r>
-        <w:rPr>
-          <w:rFonts w:ascii="Times New Roman" w:hAnsi="Times New Roman"/>
-          <w:color w:val="000000"/>
-          <w:sz w:val="24"/>
-        </w:rPr>
-        <w:t>нині</w:t>
-      </w:r>
-      <w:r>
-        <w:rPr>
-          <w:rFonts w:ascii="Times New Roman" w:hAnsi="Times New Roman"/>
-          <w:color w:val="000000"/>
-          <w:sz w:val="24"/>
-        </w:rPr>
-        <w:t xml:space="preserve"> </w:t>
-      </w:r>
-      <w:r>
-        <w:rPr>
-          <w:rFonts w:ascii="Times New Roman" w:hAnsi="Times New Roman"/>
-          <w:color w:val="000000"/>
-          <w:sz w:val="24"/>
-        </w:rPr>
-        <w:t>і</w:t>
-      </w:r>
-      <w:r>
-        <w:rPr>
-          <w:rFonts w:ascii="Times New Roman" w:hAnsi="Times New Roman"/>
-          <w:color w:val="000000"/>
-          <w:sz w:val="24"/>
-        </w:rPr>
-        <w:t xml:space="preserve"> </w:t>
-      </w:r>
-      <w:r>
-        <w:rPr>
-          <w:rFonts w:ascii="Times New Roman" w:hAnsi="Times New Roman"/>
-          <w:color w:val="000000"/>
-          <w:sz w:val="24"/>
-        </w:rPr>
-        <w:t>повсякчас,</w:t>
-      </w:r>
-      <w:r>
-        <w:rPr>
-          <w:rFonts w:ascii="Times New Roman" w:hAnsi="Times New Roman"/>
-          <w:color w:val="000000"/>
-          <w:sz w:val="24"/>
-        </w:rPr>
-        <w:t xml:space="preserve"> </w:t>
-      </w:r>
-      <w:r>
-        <w:rPr>
-          <w:rFonts w:ascii="Times New Roman" w:hAnsi="Times New Roman"/>
-          <w:color w:val="000000"/>
-          <w:sz w:val="24"/>
-        </w:rPr>
-        <w:t>і</w:t>
-      </w:r>
-      <w:r>
-        <w:rPr>
-          <w:rFonts w:ascii="Times New Roman" w:hAnsi="Times New Roman"/>
-          <w:color w:val="000000"/>
-          <w:sz w:val="24"/>
-        </w:rPr>
-        <w:t xml:space="preserve"> </w:t>
-      </w:r>
-      <w:r>
-        <w:rPr>
-          <w:rFonts w:ascii="Times New Roman" w:hAnsi="Times New Roman"/>
-          <w:color w:val="000000"/>
-          <w:sz w:val="24"/>
-        </w:rPr>
-        <w:t>на</w:t>
-      </w:r>
-      <w:r>
-        <w:rPr>
-          <w:rFonts w:ascii="Times New Roman" w:hAnsi="Times New Roman"/>
-          <w:color w:val="000000"/>
-          <w:sz w:val="24"/>
-        </w:rPr>
-        <w:t xml:space="preserve"> </w:t>
-      </w:r>
-      <w:r>
-        <w:rPr>
-          <w:rFonts w:ascii="Times New Roman" w:hAnsi="Times New Roman"/>
-          <w:color w:val="000000"/>
-          <w:sz w:val="24"/>
-        </w:rPr>
-        <w:t>віки</w:t>
-      </w:r>
-      <w:r>
-        <w:rPr>
-          <w:rFonts w:ascii="Times New Roman" w:hAnsi="Times New Roman"/>
-          <w:color w:val="000000"/>
-          <w:sz w:val="24"/>
-        </w:rPr>
-        <w:t xml:space="preserve"> </w:t>
-      </w:r>
-      <w:r>
-        <w:rPr>
-          <w:rFonts w:ascii="Times New Roman" w:hAnsi="Times New Roman"/>
-          <w:color w:val="000000"/>
-          <w:sz w:val="24"/>
-        </w:rPr>
-        <w:t>віків.</w:t>
+          <w:lang w:val="ru-MD"/>
+        </w:rPr>
+        <w:t>а, нині і повсякчас, і на віки віків.</w:t>
       </w:r>
     </w:p>
     <w:p>
@@ -6950,13 +8242,17 @@
     <w:p>
       <w:pPr>
         <w:spacing w:after="120"/>
-      </w:pPr>
-      <w:r>
-        <w:rPr>
-          <w:rFonts w:ascii="Times New Roman" w:hAnsi="Times New Roman"/>
-          <w:i/>
-          <w:color w:val="FF0000"/>
-          <w:sz w:val="24"/>
+        <w:rPr>
+          <w:lang w:val="ru-MD"/>
+        </w:rPr>
+      </w:pPr>
+      <w:r>
+        <w:rPr>
+          <w:rFonts w:ascii="Times New Roman" w:hAnsi="Times New Roman"/>
+          <w:i/>
+          <w:color w:val="FF0000"/>
+          <w:sz w:val="24"/>
+          <w:lang w:val="ru-MD"/>
         </w:rPr>
         <w:t xml:space="preserve">Стих: </w:t>
       </w:r>
@@ -6965,6 +8261,7 @@
           <w:rFonts w:ascii="Times New Roman" w:hAnsi="Times New Roman"/>
           <w:sz w:val="24"/>
           <w:u w:val="single"/>
+          <w:lang w:val="ru-MD"/>
         </w:rPr>
         <w:t>Госпо́дь царю́є,* у ве́лич Він зодягну́вся.</w:t>
       </w:r>
@@ -6974,6 +8271,7 @@
           <w:i/>
           <w:color w:val="FF0000"/>
           <w:sz w:val="24"/>
+          <w:lang w:val="ru-MD"/>
         </w:rPr>
         <w:t xml:space="preserve"> (Пс. 92,1)</w:t>
       </w:r>
@@ -7002,13 +8300,17 @@
     <w:p>
       <w:pPr>
         <w:spacing w:after="120"/>
-      </w:pPr>
-      <w:r>
-        <w:rPr>
-          <w:rFonts w:ascii="Times New Roman" w:hAnsi="Times New Roman"/>
-          <w:i/>
-          <w:color w:val="FF0000"/>
-          <w:sz w:val="24"/>
+        <w:rPr>
+          <w:lang w:val="ru-MD"/>
+        </w:rPr>
+      </w:pPr>
+      <w:r>
+        <w:rPr>
+          <w:rFonts w:ascii="Times New Roman" w:hAnsi="Times New Roman"/>
+          <w:i/>
+          <w:color w:val="FF0000"/>
+          <w:sz w:val="24"/>
+          <w:lang w:val="ru-MD"/>
         </w:rPr>
         <w:t xml:space="preserve">Стих: </w:t>
       </w:r>
@@ -7017,6 +8319,7 @@
           <w:rFonts w:ascii="Times New Roman" w:hAnsi="Times New Roman"/>
           <w:sz w:val="24"/>
           <w:u w:val="single"/>
+          <w:lang w:val="ru-MD"/>
         </w:rPr>
         <w:t>Бо Він утверди́в вселе́нну,* і вона́ не захита́ється.</w:t>
       </w:r>
@@ -7026,6 +8329,7 @@
           <w:i/>
           <w:color w:val="FF0000"/>
           <w:sz w:val="24"/>
+          <w:lang w:val="ru-MD"/>
         </w:rPr>
         <w:t xml:space="preserve"> (Пс. 92,1)</w:t>
       </w:r>
@@ -7064,13 +8368,17 @@
     <w:p>
       <w:pPr>
         <w:spacing w:after="120"/>
-      </w:pPr>
-      <w:r>
-        <w:rPr>
-          <w:rFonts w:ascii="Times New Roman" w:hAnsi="Times New Roman"/>
-          <w:i/>
-          <w:color w:val="FF0000"/>
-          <w:sz w:val="24"/>
+        <w:rPr>
+          <w:lang w:val="ru-MD"/>
+        </w:rPr>
+      </w:pPr>
+      <w:r>
+        <w:rPr>
+          <w:rFonts w:ascii="Times New Roman" w:hAnsi="Times New Roman"/>
+          <w:i/>
+          <w:color w:val="FF0000"/>
+          <w:sz w:val="24"/>
+          <w:lang w:val="ru-MD"/>
         </w:rPr>
         <w:t xml:space="preserve">Стих: </w:t>
       </w:r>
@@ -7079,6 +8387,7 @@
           <w:rFonts w:ascii="Times New Roman" w:hAnsi="Times New Roman"/>
           <w:sz w:val="24"/>
           <w:u w:val="single"/>
+          <w:lang w:val="ru-MD"/>
         </w:rPr>
         <w:t>До́мові Твоє́му, Го́споди,* нале́жить свя́тість на до́вгі лі́та.</w:t>
       </w:r>
@@ -7088,6 +8397,7 @@
           <w:i/>
           <w:color w:val="FF0000"/>
           <w:sz w:val="24"/>
+          <w:lang w:val="ru-MD"/>
         </w:rPr>
         <w:t xml:space="preserve"> (Пс. 92,5)</w:t>
       </w:r>
@@ -7182,432 +8492,74 @@
     </w:p>
     <w:p>
       <w:pPr>
-        <w:pStyle w:val="Normal"/>
-        <w:spacing w:after="120"/>
-      </w:pPr>
-      <w:r>
-        <w:rPr>
-          <w:rFonts w:ascii="Times New Roman" w:hAnsi="Times New Roman"/>
-          <w:sz w:val="24"/>
-        </w:rPr>
-        <w:t>Ни́ні</w:t>
-      </w:r>
-      <w:r>
-        <w:rPr>
-          <w:rFonts w:ascii="Times New Roman" w:hAnsi="Times New Roman"/>
-          <w:sz w:val="24"/>
-        </w:rPr>
-        <w:t xml:space="preserve"> </w:t>
-      </w:r>
-      <w:r>
-        <w:rPr>
-          <w:rFonts w:ascii="Times New Roman" w:hAnsi="Times New Roman"/>
-          <w:sz w:val="24"/>
-        </w:rPr>
-        <w:t>відпуска́єш</w:t>
-      </w:r>
-      <w:r>
-        <w:rPr>
-          <w:rFonts w:ascii="Times New Roman" w:hAnsi="Times New Roman"/>
-          <w:sz w:val="24"/>
-        </w:rPr>
-        <w:t xml:space="preserve"> </w:t>
-      </w:r>
-      <w:r>
-        <w:rPr>
-          <w:rFonts w:ascii="Times New Roman" w:hAnsi="Times New Roman"/>
-          <w:sz w:val="24"/>
-        </w:rPr>
-        <w:t>слугу́</w:t>
-      </w:r>
-      <w:r>
-        <w:rPr>
-          <w:rFonts w:ascii="Times New Roman" w:hAnsi="Times New Roman"/>
-          <w:sz w:val="24"/>
-        </w:rPr>
-        <w:t xml:space="preserve"> </w:t>
-      </w:r>
-      <w:r>
-        <w:rPr>
-          <w:rFonts w:ascii="Times New Roman" w:hAnsi="Times New Roman"/>
-          <w:sz w:val="24"/>
-        </w:rPr>
-        <w:t>Твого́,</w:t>
-      </w:r>
-      <w:r>
-        <w:rPr>
-          <w:rFonts w:ascii="Times New Roman" w:hAnsi="Times New Roman"/>
-          <w:sz w:val="24"/>
-        </w:rPr>
-        <w:t xml:space="preserve"> </w:t>
-      </w:r>
-      <w:r>
-        <w:rPr>
-          <w:rFonts w:ascii="Times New Roman" w:hAnsi="Times New Roman"/>
-          <w:sz w:val="24"/>
-        </w:rPr>
-        <w:t>Влади́ко,*</w:t>
-      </w:r>
-      <w:r>
-        <w:rPr>
-          <w:rFonts w:ascii="Times New Roman" w:hAnsi="Times New Roman"/>
-          <w:sz w:val="24"/>
-        </w:rPr>
-        <w:t xml:space="preserve"> </w:t>
-      </w:r>
-      <w:r>
-        <w:rPr>
-          <w:rFonts w:ascii="Times New Roman" w:hAnsi="Times New Roman"/>
-          <w:sz w:val="24"/>
-        </w:rPr>
-        <w:t>за</w:t>
-      </w:r>
-      <w:r>
-        <w:rPr>
-          <w:rFonts w:ascii="Times New Roman" w:hAnsi="Times New Roman"/>
-          <w:sz w:val="24"/>
-        </w:rPr>
-        <w:t xml:space="preserve"> </w:t>
-      </w:r>
-      <w:r>
-        <w:rPr>
-          <w:rFonts w:ascii="Times New Roman" w:hAnsi="Times New Roman"/>
-          <w:sz w:val="24"/>
-        </w:rPr>
-        <w:t>Твої́м</w:t>
-      </w:r>
-      <w:r>
-        <w:rPr>
-          <w:rFonts w:ascii="Times New Roman" w:hAnsi="Times New Roman"/>
-          <w:sz w:val="24"/>
-        </w:rPr>
-        <w:t xml:space="preserve"> </w:t>
-      </w:r>
-      <w:r>
-        <w:rPr>
-          <w:rFonts w:ascii="Times New Roman" w:hAnsi="Times New Roman"/>
-          <w:sz w:val="24"/>
-        </w:rPr>
-        <w:t>сло́вом</w:t>
-      </w:r>
-      <w:r>
-        <w:rPr>
-          <w:rFonts w:ascii="Times New Roman" w:hAnsi="Times New Roman"/>
-          <w:sz w:val="24"/>
-        </w:rPr>
-        <w:t xml:space="preserve"> </w:t>
-      </w:r>
-      <w:r>
-        <w:rPr>
-          <w:rFonts w:ascii="Times New Roman" w:hAnsi="Times New Roman"/>
-          <w:sz w:val="24"/>
-        </w:rPr>
-        <w:t>у</w:t>
-      </w:r>
-      <w:r>
-        <w:rPr>
-          <w:rFonts w:ascii="Times New Roman" w:hAnsi="Times New Roman"/>
-          <w:sz w:val="24"/>
-        </w:rPr>
-        <w:t xml:space="preserve"> </w:t>
-      </w:r>
-      <w:r>
-        <w:rPr>
-          <w:rFonts w:ascii="Times New Roman" w:hAnsi="Times New Roman"/>
-          <w:sz w:val="24"/>
-        </w:rPr>
-        <w:t>ми́рі.</w:t>
-      </w:r>
-    </w:p>
-    <w:p>
-      <w:pPr>
-        <w:pStyle w:val="Normal"/>
-        <w:spacing w:after="120"/>
-      </w:pPr>
-      <w:r>
-        <w:rPr>
-          <w:rFonts w:ascii="Times New Roman" w:hAnsi="Times New Roman"/>
-          <w:sz w:val="24"/>
-        </w:rPr>
-        <w:t>Бо</w:t>
-      </w:r>
-      <w:r>
-        <w:rPr>
-          <w:rFonts w:ascii="Times New Roman" w:hAnsi="Times New Roman"/>
-          <w:sz w:val="24"/>
-        </w:rPr>
-        <w:t xml:space="preserve"> </w:t>
-      </w:r>
-      <w:r>
-        <w:rPr>
-          <w:rFonts w:ascii="Times New Roman" w:hAnsi="Times New Roman"/>
-          <w:sz w:val="24"/>
-        </w:rPr>
-        <w:t>поба́чили</w:t>
-      </w:r>
-      <w:r>
-        <w:rPr>
-          <w:rFonts w:ascii="Times New Roman" w:hAnsi="Times New Roman"/>
-          <w:sz w:val="24"/>
-        </w:rPr>
-        <w:t xml:space="preserve"> </w:t>
-      </w:r>
-      <w:r>
-        <w:rPr>
-          <w:rFonts w:ascii="Times New Roman" w:hAnsi="Times New Roman"/>
-          <w:sz w:val="24"/>
-        </w:rPr>
-        <w:t>о́чі</w:t>
-      </w:r>
-      <w:r>
-        <w:rPr>
-          <w:rFonts w:ascii="Times New Roman" w:hAnsi="Times New Roman"/>
-          <w:sz w:val="24"/>
-        </w:rPr>
-        <w:t xml:space="preserve"> </w:t>
-      </w:r>
-      <w:r>
-        <w:rPr>
-          <w:rFonts w:ascii="Times New Roman" w:hAnsi="Times New Roman"/>
-          <w:sz w:val="24"/>
-        </w:rPr>
-        <w:t>мої́*</w:t>
-      </w:r>
-      <w:r>
-        <w:rPr>
-          <w:rFonts w:ascii="Times New Roman" w:hAnsi="Times New Roman"/>
-          <w:sz w:val="24"/>
-        </w:rPr>
-        <w:t xml:space="preserve"> </w:t>
-      </w:r>
-      <w:r>
-        <w:rPr>
-          <w:rFonts w:ascii="Times New Roman" w:hAnsi="Times New Roman"/>
-          <w:sz w:val="24"/>
-        </w:rPr>
-        <w:t>спасі́ння</w:t>
-      </w:r>
-      <w:r>
-        <w:rPr>
-          <w:rFonts w:ascii="Times New Roman" w:hAnsi="Times New Roman"/>
-          <w:sz w:val="24"/>
-        </w:rPr>
-        <w:t xml:space="preserve"> </w:t>
-      </w:r>
-      <w:r>
-        <w:rPr>
-          <w:rFonts w:ascii="Times New Roman" w:hAnsi="Times New Roman"/>
-          <w:sz w:val="24"/>
-        </w:rPr>
-        <w:t>Твоє́;</w:t>
-      </w:r>
-    </w:p>
-    <w:p>
-      <w:pPr>
-        <w:pStyle w:val="Normal"/>
-        <w:spacing w:after="120"/>
-      </w:pPr>
-      <w:r>
-        <w:rPr>
-          <w:rFonts w:ascii="Times New Roman" w:hAnsi="Times New Roman"/>
-          <w:sz w:val="24"/>
-        </w:rPr>
-        <w:t>Що</w:t>
-      </w:r>
-      <w:r>
-        <w:rPr>
-          <w:rFonts w:ascii="Times New Roman" w:hAnsi="Times New Roman"/>
-          <w:sz w:val="24"/>
-        </w:rPr>
-        <w:t xml:space="preserve"> </w:t>
-      </w:r>
-      <w:r>
-        <w:rPr>
-          <w:rFonts w:ascii="Times New Roman" w:hAnsi="Times New Roman"/>
-          <w:sz w:val="24"/>
-        </w:rPr>
-        <w:t>приготува́в</w:t>
-      </w:r>
-      <w:r>
-        <w:rPr>
-          <w:rFonts w:ascii="Times New Roman" w:hAnsi="Times New Roman"/>
-          <w:sz w:val="24"/>
-        </w:rPr>
-        <w:t xml:space="preserve"> </w:t>
-      </w:r>
-      <w:r>
-        <w:rPr>
-          <w:rFonts w:ascii="Times New Roman" w:hAnsi="Times New Roman"/>
-          <w:sz w:val="24"/>
-        </w:rPr>
-        <w:t>Ти*</w:t>
-      </w:r>
-      <w:r>
-        <w:rPr>
-          <w:rFonts w:ascii="Times New Roman" w:hAnsi="Times New Roman"/>
-          <w:sz w:val="24"/>
-        </w:rPr>
-        <w:t xml:space="preserve"> </w:t>
-      </w:r>
-      <w:r>
-        <w:rPr>
-          <w:rFonts w:ascii="Times New Roman" w:hAnsi="Times New Roman"/>
-          <w:sz w:val="24"/>
-        </w:rPr>
-        <w:t>пе́ред</w:t>
-      </w:r>
-      <w:r>
-        <w:rPr>
-          <w:rFonts w:ascii="Times New Roman" w:hAnsi="Times New Roman"/>
-          <w:sz w:val="24"/>
-        </w:rPr>
-        <w:t xml:space="preserve"> </w:t>
-      </w:r>
-      <w:r>
-        <w:rPr>
-          <w:rFonts w:ascii="Times New Roman" w:hAnsi="Times New Roman"/>
-          <w:sz w:val="24"/>
-        </w:rPr>
-        <w:t>усіма́</w:t>
-      </w:r>
-      <w:r>
-        <w:rPr>
-          <w:rFonts w:ascii="Times New Roman" w:hAnsi="Times New Roman"/>
-          <w:sz w:val="24"/>
-        </w:rPr>
-        <w:t xml:space="preserve"> </w:t>
-      </w:r>
-      <w:r>
-        <w:rPr>
-          <w:rFonts w:ascii="Times New Roman" w:hAnsi="Times New Roman"/>
-          <w:sz w:val="24"/>
-        </w:rPr>
-        <w:t>наро́дами;</w:t>
-      </w:r>
-    </w:p>
-    <w:p>
-      <w:pPr>
-        <w:pStyle w:val="Normal"/>
-        <w:spacing w:after="120"/>
-      </w:pPr>
-      <w:r>
-        <w:rPr>
-          <w:rFonts w:ascii="Times New Roman" w:hAnsi="Times New Roman"/>
-          <w:sz w:val="24"/>
-        </w:rPr>
-        <w:t>Сві́тло</w:t>
-      </w:r>
-      <w:r>
-        <w:rPr>
-          <w:rFonts w:ascii="Times New Roman" w:hAnsi="Times New Roman"/>
-          <w:sz w:val="24"/>
-        </w:rPr>
-        <w:t xml:space="preserve"> </w:t>
-      </w:r>
-      <w:r>
-        <w:rPr>
-          <w:rFonts w:ascii="Times New Roman" w:hAnsi="Times New Roman"/>
-          <w:sz w:val="24"/>
-        </w:rPr>
-        <w:t>на</w:t>
-      </w:r>
-      <w:r>
-        <w:rPr>
-          <w:rFonts w:ascii="Times New Roman" w:hAnsi="Times New Roman"/>
-          <w:sz w:val="24"/>
-        </w:rPr>
-        <w:t xml:space="preserve"> </w:t>
-      </w:r>
-      <w:r>
-        <w:rPr>
-          <w:rFonts w:ascii="Times New Roman" w:hAnsi="Times New Roman"/>
-          <w:sz w:val="24"/>
-        </w:rPr>
-        <w:t>просві́ту</w:t>
-      </w:r>
-      <w:r>
-        <w:rPr>
-          <w:rFonts w:ascii="Times New Roman" w:hAnsi="Times New Roman"/>
-          <w:sz w:val="24"/>
-        </w:rPr>
-        <w:t xml:space="preserve"> </w:t>
-      </w:r>
-      <w:r>
-        <w:rPr>
-          <w:rFonts w:ascii="Times New Roman" w:hAnsi="Times New Roman"/>
-          <w:sz w:val="24"/>
-        </w:rPr>
-        <w:t>пога́нам,*</w:t>
-      </w:r>
-      <w:r>
-        <w:rPr>
-          <w:rFonts w:ascii="Times New Roman" w:hAnsi="Times New Roman"/>
-          <w:sz w:val="24"/>
-        </w:rPr>
-        <w:t xml:space="preserve"> </w:t>
-      </w:r>
-      <w:r>
-        <w:rPr>
-          <w:rFonts w:ascii="Times New Roman" w:hAnsi="Times New Roman"/>
-          <w:sz w:val="24"/>
-        </w:rPr>
-        <w:t>і</w:t>
-      </w:r>
-      <w:r>
-        <w:rPr>
-          <w:rFonts w:ascii="Times New Roman" w:hAnsi="Times New Roman"/>
-          <w:sz w:val="24"/>
-        </w:rPr>
-        <w:t xml:space="preserve"> </w:t>
-      </w:r>
-      <w:r>
-        <w:rPr>
-          <w:rFonts w:ascii="Times New Roman" w:hAnsi="Times New Roman"/>
-          <w:sz w:val="24"/>
-        </w:rPr>
-        <w:t>сла́ву</w:t>
-      </w:r>
-      <w:r>
-        <w:rPr>
-          <w:rFonts w:ascii="Times New Roman" w:hAnsi="Times New Roman"/>
-          <w:sz w:val="24"/>
-        </w:rPr>
-        <w:t xml:space="preserve"> </w:t>
-      </w:r>
-      <w:r>
-        <w:rPr>
-          <w:rFonts w:ascii="Times New Roman" w:hAnsi="Times New Roman"/>
-          <w:sz w:val="24"/>
-        </w:rPr>
-        <w:t>лю́ду</w:t>
-      </w:r>
-      <w:r>
-        <w:rPr>
-          <w:rFonts w:ascii="Times New Roman" w:hAnsi="Times New Roman"/>
-          <w:sz w:val="24"/>
-        </w:rPr>
-        <w:t xml:space="preserve"> </w:t>
-      </w:r>
-      <w:r>
-        <w:rPr>
-          <w:rFonts w:ascii="Times New Roman" w:hAnsi="Times New Roman"/>
-          <w:sz w:val="24"/>
-        </w:rPr>
-        <w:t>Твого́,</w:t>
-      </w:r>
-      <w:r>
-        <w:rPr>
-          <w:rFonts w:ascii="Times New Roman" w:hAnsi="Times New Roman"/>
-          <w:sz w:val="24"/>
-        </w:rPr>
-        <w:t xml:space="preserve"> </w:t>
-      </w:r>
-      <w:r>
-        <w:rPr>
-          <w:rFonts w:ascii="Times New Roman" w:hAnsi="Times New Roman"/>
-          <w:sz w:val="24"/>
-        </w:rPr>
-        <w:t>Ізра́їля.</w:t>
+        <w:spacing w:after="120"/>
+        <w:rPr>
+          <w:lang w:val="ru-MD"/>
+        </w:rPr>
+      </w:pPr>
+      <w:r>
+        <w:rPr>
+          <w:rFonts w:ascii="Times New Roman" w:hAnsi="Times New Roman"/>
+          <w:sz w:val="24"/>
+          <w:lang w:val="ru-MD"/>
+        </w:rPr>
+        <w:t>Ни́ні відпуска́єш слугу́ Твого́, Влади́ко,* за Твої́м сло́вом у ми́рі.</w:t>
+      </w:r>
+    </w:p>
+    <w:p>
+      <w:pPr>
+        <w:spacing w:after="120"/>
+        <w:rPr>
+          <w:lang w:val="ru-MD"/>
+        </w:rPr>
+      </w:pPr>
+      <w:r>
+        <w:rPr>
+          <w:rFonts w:ascii="Times New Roman" w:hAnsi="Times New Roman"/>
+          <w:sz w:val="24"/>
+          <w:lang w:val="ru-MD"/>
+        </w:rPr>
+        <w:t>Бо поба́чили о́чі мої́* спасі́ння Твоє́;</w:t>
+      </w:r>
+    </w:p>
+    <w:p>
+      <w:pPr>
+        <w:spacing w:after="120"/>
+        <w:rPr>
+          <w:lang w:val="ru-MD"/>
+        </w:rPr>
+      </w:pPr>
+      <w:r>
+        <w:rPr>
+          <w:rFonts w:ascii="Times New Roman" w:hAnsi="Times New Roman"/>
+          <w:sz w:val="24"/>
+          <w:lang w:val="ru-MD"/>
+        </w:rPr>
+        <w:t>Що приготува́в Ти* пе́ред усіма́ наро́дами;</w:t>
+      </w:r>
+    </w:p>
+    <w:p>
+      <w:pPr>
+        <w:spacing w:after="120"/>
+        <w:rPr>
+          <w:lang w:val="ru-MD"/>
+        </w:rPr>
+      </w:pPr>
+      <w:r>
+        <w:rPr>
+          <w:rFonts w:ascii="Times New Roman" w:hAnsi="Times New Roman"/>
+          <w:sz w:val="24"/>
+          <w:lang w:val="ru-MD"/>
+        </w:rPr>
+        <w:t xml:space="preserve">Сві́тло на просві́ту пога́нам,* і сла́ву лю́ду </w:t>
+      </w:r>
+      <w:r>
+        <w:rPr>
+          <w:rFonts w:ascii="Times New Roman" w:hAnsi="Times New Roman"/>
+          <w:sz w:val="24"/>
+          <w:lang w:val="ru-MD"/>
+        </w:rPr>
+        <w:t>Твого́, Ізра́їля.</w:t>
       </w:r>
     </w:p>
     <w:p>
@@ -15561,15 +16513,18 @@
     </w:p>
     <w:p>
       <w:pPr>
-        <w:pStyle w:val="Normal"/>
-        <w:spacing w:after="120"/>
-      </w:pPr>
-      <w:r>
-        <w:rPr>
-          <w:rFonts w:ascii="Times New Roman" w:hAnsi="Times New Roman"/>
-          <w:i/>
-          <w:color w:val="FF0000"/>
-          <w:sz w:val="24"/>
+        <w:spacing w:after="120"/>
+        <w:rPr>
+          <w:lang w:val="ru-MD"/>
+        </w:rPr>
+      </w:pPr>
+      <w:r>
+        <w:rPr>
+          <w:rFonts w:ascii="Times New Roman" w:hAnsi="Times New Roman"/>
+          <w:i/>
+          <w:color w:val="FF0000"/>
+          <w:sz w:val="24"/>
+          <w:lang w:val="ru-MD"/>
         </w:rPr>
         <w:t>Священик:</w:t>
       </w:r>
@@ -15578,448 +16533,9 @@
           <w:rFonts w:ascii="Times New Roman" w:hAnsi="Times New Roman"/>
           <w:color w:val="000000"/>
           <w:sz w:val="24"/>
-        </w:rPr>
-        <w:t xml:space="preserve"> </w:t>
-      </w:r>
-      <w:r>
-        <w:rPr>
-          <w:rFonts w:ascii="Times New Roman" w:hAnsi="Times New Roman"/>
-          <w:color w:val="000000"/>
-          <w:sz w:val="24"/>
-        </w:rPr>
-        <w:t>Бо</w:t>
-      </w:r>
-      <w:r>
-        <w:rPr>
-          <w:rFonts w:ascii="Times New Roman" w:hAnsi="Times New Roman"/>
-          <w:color w:val="000000"/>
-          <w:sz w:val="24"/>
-        </w:rPr>
-        <w:t xml:space="preserve"> </w:t>
-      </w:r>
-      <w:r>
-        <w:rPr>
-          <w:rFonts w:ascii="Times New Roman" w:hAnsi="Times New Roman"/>
-          <w:color w:val="000000"/>
-          <w:sz w:val="24"/>
-        </w:rPr>
-        <w:t>Ти</w:t>
-      </w:r>
-      <w:r>
-        <w:rPr>
-          <w:rFonts w:ascii="Times New Roman" w:hAnsi="Times New Roman"/>
-          <w:color w:val="000000"/>
-          <w:sz w:val="24"/>
-        </w:rPr>
-        <w:t xml:space="preserve"> </w:t>
-      </w:r>
-      <w:r>
-        <w:rPr>
-          <w:rFonts w:ascii="Times New Roman" w:hAnsi="Times New Roman"/>
-          <w:color w:val="000000"/>
-          <w:sz w:val="24"/>
-        </w:rPr>
-        <w:t>святий</w:t>
-      </w:r>
-      <w:r>
-        <w:rPr>
-          <w:rFonts w:ascii="Times New Roman" w:hAnsi="Times New Roman"/>
-          <w:color w:val="000000"/>
-          <w:sz w:val="24"/>
-        </w:rPr>
-        <w:t xml:space="preserve"> </w:t>
-      </w:r>
-      <w:r>
-        <w:rPr>
-          <w:rFonts w:ascii="Times New Roman" w:hAnsi="Times New Roman"/>
-          <w:color w:val="000000"/>
-          <w:sz w:val="24"/>
-        </w:rPr>
-        <w:t>єси,</w:t>
-      </w:r>
-      <w:r>
-        <w:rPr>
-          <w:rFonts w:ascii="Times New Roman" w:hAnsi="Times New Roman"/>
-          <w:color w:val="000000"/>
-          <w:sz w:val="24"/>
-        </w:rPr>
-        <w:t xml:space="preserve"> </w:t>
-      </w:r>
-      <w:r>
-        <w:rPr>
-          <w:rFonts w:ascii="Times New Roman" w:hAnsi="Times New Roman"/>
-          <w:color w:val="000000"/>
-          <w:sz w:val="24"/>
-        </w:rPr>
-        <w:t>Боже</w:t>
-      </w:r>
-      <w:r>
-        <w:rPr>
-          <w:rFonts w:ascii="Times New Roman" w:hAnsi="Times New Roman"/>
-          <w:color w:val="000000"/>
-          <w:sz w:val="24"/>
-        </w:rPr>
-        <w:t xml:space="preserve"> </w:t>
-      </w:r>
-      <w:r>
-        <w:rPr>
-          <w:rFonts w:ascii="Times New Roman" w:hAnsi="Times New Roman"/>
-          <w:color w:val="000000"/>
-          <w:sz w:val="24"/>
-        </w:rPr>
-        <w:t>наш,</w:t>
-      </w:r>
-      <w:r>
-        <w:rPr>
-          <w:rFonts w:ascii="Times New Roman" w:hAnsi="Times New Roman"/>
-          <w:color w:val="000000"/>
-          <w:sz w:val="24"/>
-        </w:rPr>
-        <w:t xml:space="preserve"> </w:t>
-      </w:r>
-      <w:r>
-        <w:rPr>
-          <w:rFonts w:ascii="Times New Roman" w:hAnsi="Times New Roman"/>
-          <w:color w:val="000000"/>
-          <w:sz w:val="24"/>
-        </w:rPr>
-        <w:t>і</w:t>
-      </w:r>
-      <w:r>
-        <w:rPr>
-          <w:rFonts w:ascii="Times New Roman" w:hAnsi="Times New Roman"/>
-          <w:color w:val="000000"/>
-          <w:sz w:val="24"/>
-        </w:rPr>
-        <w:t xml:space="preserve"> </w:t>
-      </w:r>
-      <w:r>
-        <w:rPr>
-          <w:rFonts w:ascii="Times New Roman" w:hAnsi="Times New Roman"/>
-          <w:color w:val="000000"/>
-          <w:sz w:val="24"/>
-        </w:rPr>
-        <w:t>в</w:t>
-      </w:r>
-      <w:r>
-        <w:rPr>
-          <w:rFonts w:ascii="Times New Roman" w:hAnsi="Times New Roman"/>
-          <w:color w:val="000000"/>
-          <w:sz w:val="24"/>
-        </w:rPr>
-        <w:t xml:space="preserve"> </w:t>
-      </w:r>
-      <w:r>
-        <w:rPr>
-          <w:rFonts w:ascii="Times New Roman" w:hAnsi="Times New Roman"/>
-          <w:color w:val="000000"/>
-          <w:sz w:val="24"/>
-        </w:rPr>
-        <w:t>святині</w:t>
-      </w:r>
-      <w:r>
-        <w:rPr>
-          <w:rFonts w:ascii="Times New Roman" w:hAnsi="Times New Roman"/>
-          <w:color w:val="000000"/>
-          <w:sz w:val="24"/>
-        </w:rPr>
-        <w:t xml:space="preserve"> </w:t>
-      </w:r>
-      <w:r>
-        <w:rPr>
-          <w:rFonts w:ascii="Times New Roman" w:hAnsi="Times New Roman"/>
-          <w:color w:val="000000"/>
-          <w:sz w:val="24"/>
-        </w:rPr>
-        <w:t>перебуваєш,</w:t>
-      </w:r>
-      <w:r>
-        <w:rPr>
-          <w:rFonts w:ascii="Times New Roman" w:hAnsi="Times New Roman"/>
-          <w:color w:val="000000"/>
-          <w:sz w:val="24"/>
-        </w:rPr>
-        <w:t xml:space="preserve"> </w:t>
-      </w:r>
-      <w:r>
-        <w:rPr>
-          <w:rFonts w:ascii="Times New Roman" w:hAnsi="Times New Roman"/>
-          <w:color w:val="000000"/>
-          <w:sz w:val="24"/>
-        </w:rPr>
-        <w:t>і</w:t>
-      </w:r>
-      <w:r>
-        <w:rPr>
-          <w:rFonts w:ascii="Times New Roman" w:hAnsi="Times New Roman"/>
-          <w:color w:val="000000"/>
-          <w:sz w:val="24"/>
-        </w:rPr>
-        <w:t xml:space="preserve"> </w:t>
-      </w:r>
-      <w:r>
-        <w:rPr>
-          <w:rFonts w:ascii="Times New Roman" w:hAnsi="Times New Roman"/>
-          <w:color w:val="000000"/>
-          <w:sz w:val="24"/>
-        </w:rPr>
-        <w:t>ми</w:t>
-      </w:r>
-      <w:r>
-        <w:rPr>
-          <w:rFonts w:ascii="Times New Roman" w:hAnsi="Times New Roman"/>
-          <w:color w:val="000000"/>
-          <w:sz w:val="24"/>
-        </w:rPr>
-        <w:t xml:space="preserve"> </w:t>
-      </w:r>
-      <w:r>
-        <w:rPr>
-          <w:rFonts w:ascii="Times New Roman" w:hAnsi="Times New Roman"/>
-          <w:color w:val="000000"/>
-          <w:sz w:val="24"/>
-        </w:rPr>
-        <w:t>Тобі</w:t>
-      </w:r>
-      <w:r>
-        <w:rPr>
-          <w:rFonts w:ascii="Times New Roman" w:hAnsi="Times New Roman"/>
-          <w:color w:val="000000"/>
-          <w:sz w:val="24"/>
-        </w:rPr>
-        <w:t xml:space="preserve"> </w:t>
-      </w:r>
-      <w:r>
-        <w:rPr>
-          <w:rFonts w:ascii="Times New Roman" w:hAnsi="Times New Roman"/>
-          <w:color w:val="000000"/>
-          <w:sz w:val="24"/>
-        </w:rPr>
-        <w:t>славу</w:t>
-      </w:r>
-      <w:r>
-        <w:rPr>
-          <w:rFonts w:ascii="Times New Roman" w:hAnsi="Times New Roman"/>
-          <w:color w:val="000000"/>
-          <w:sz w:val="24"/>
-        </w:rPr>
-        <w:t xml:space="preserve"> </w:t>
-      </w:r>
-      <w:r>
-        <w:rPr>
-          <w:rFonts w:ascii="Times New Roman" w:hAnsi="Times New Roman"/>
-          <w:color w:val="000000"/>
-          <w:sz w:val="24"/>
-        </w:rPr>
-        <w:t>віддаємо:</w:t>
-      </w:r>
-      <w:r>
-        <w:rPr>
-          <w:rFonts w:ascii="Times New Roman" w:hAnsi="Times New Roman"/>
-          <w:color w:val="000000"/>
-          <w:sz w:val="24"/>
-        </w:rPr>
-        <w:t xml:space="preserve"> </w:t>
-      </w:r>
-      <w:r>
-        <w:rPr>
-          <w:rFonts w:ascii="Times New Roman" w:hAnsi="Times New Roman"/>
-          <w:color w:val="000000"/>
-          <w:sz w:val="24"/>
-        </w:rPr>
-        <w:t>Отцю,</w:t>
-      </w:r>
-      <w:r>
-        <w:rPr>
-          <w:rFonts w:ascii="Times New Roman" w:hAnsi="Times New Roman"/>
-          <w:color w:val="000000"/>
-          <w:sz w:val="24"/>
-        </w:rPr>
-        <w:t xml:space="preserve"> </w:t>
-      </w:r>
-      <w:r>
-        <w:rPr>
-          <w:rFonts w:ascii="Times New Roman" w:hAnsi="Times New Roman"/>
-          <w:color w:val="000000"/>
-          <w:sz w:val="24"/>
-        </w:rPr>
-        <w:t>і</w:t>
-      </w:r>
-      <w:r>
-        <w:rPr>
-          <w:rFonts w:ascii="Times New Roman" w:hAnsi="Times New Roman"/>
-          <w:color w:val="000000"/>
-          <w:sz w:val="24"/>
-        </w:rPr>
-        <w:t xml:space="preserve"> </w:t>
-      </w:r>
-      <w:r>
-        <w:rPr>
-          <w:rFonts w:ascii="Times New Roman" w:hAnsi="Times New Roman"/>
-          <w:color w:val="000000"/>
-          <w:sz w:val="24"/>
-        </w:rPr>
-        <w:t>Сину,</w:t>
-      </w:r>
-      <w:r>
-        <w:rPr>
-          <w:rFonts w:ascii="Times New Roman" w:hAnsi="Times New Roman"/>
-          <w:color w:val="000000"/>
-          <w:sz w:val="24"/>
-        </w:rPr>
-        <w:t xml:space="preserve"> </w:t>
-      </w:r>
-      <w:r>
-        <w:rPr>
-          <w:rFonts w:ascii="Times New Roman" w:hAnsi="Times New Roman"/>
-          <w:color w:val="000000"/>
-          <w:sz w:val="24"/>
-        </w:rPr>
-        <w:t>і</w:t>
-      </w:r>
-      <w:r>
-        <w:rPr>
-          <w:rFonts w:ascii="Times New Roman" w:hAnsi="Times New Roman"/>
-          <w:color w:val="000000"/>
-          <w:sz w:val="24"/>
-        </w:rPr>
-        <w:t xml:space="preserve"> </w:t>
-      </w:r>
-      <w:r>
-        <w:rPr>
-          <w:rFonts w:ascii="Times New Roman" w:hAnsi="Times New Roman"/>
-          <w:color w:val="000000"/>
-          <w:sz w:val="24"/>
-        </w:rPr>
-        <w:t>Святому</w:t>
-      </w:r>
-      <w:r>
-        <w:rPr>
-          <w:rFonts w:ascii="Times New Roman" w:hAnsi="Times New Roman"/>
-          <w:color w:val="000000"/>
-          <w:sz w:val="24"/>
-        </w:rPr>
-        <w:t xml:space="preserve"> </w:t>
-      </w:r>
-      <w:r>
-        <w:rPr>
-          <w:rFonts w:ascii="Times New Roman" w:hAnsi="Times New Roman"/>
-          <w:color w:val="000000"/>
-          <w:sz w:val="24"/>
-        </w:rPr>
-        <w:t>Духові,</w:t>
-      </w:r>
-      <w:r>
-        <w:rPr>
-          <w:rFonts w:ascii="Times New Roman" w:hAnsi="Times New Roman"/>
-          <w:color w:val="000000"/>
-          <w:sz w:val="24"/>
-        </w:rPr>
-        <w:t xml:space="preserve"> </w:t>
-      </w:r>
-      <w:r>
-        <w:rPr>
-          <w:rFonts w:ascii="Times New Roman" w:hAnsi="Times New Roman"/>
-          <w:color w:val="000000"/>
-          <w:sz w:val="24"/>
-        </w:rPr>
-        <w:t>нині</w:t>
-      </w:r>
-      <w:r>
-        <w:rPr>
-          <w:rFonts w:ascii="Times New Roman" w:hAnsi="Times New Roman"/>
-          <w:color w:val="000000"/>
-          <w:sz w:val="24"/>
-        </w:rPr>
-        <w:t xml:space="preserve"> </w:t>
-      </w:r>
-      <w:r>
-        <w:rPr>
-          <w:rFonts w:ascii="Times New Roman" w:hAnsi="Times New Roman"/>
-          <w:color w:val="000000"/>
-          <w:sz w:val="24"/>
-        </w:rPr>
-        <w:t>і</w:t>
-      </w:r>
-      <w:r>
-        <w:rPr>
-          <w:rFonts w:ascii="Times New Roman" w:hAnsi="Times New Roman"/>
-          <w:color w:val="000000"/>
-          <w:sz w:val="24"/>
-        </w:rPr>
-        <w:t xml:space="preserve"> </w:t>
-      </w:r>
-      <w:r>
-        <w:rPr>
-          <w:rFonts w:ascii="Times New Roman" w:hAnsi="Times New Roman"/>
-          <w:color w:val="000000"/>
-          <w:sz w:val="24"/>
-        </w:rPr>
-        <w:t>повсякчас,</w:t>
-      </w:r>
-      <w:r>
-        <w:rPr>
-          <w:rFonts w:ascii="Times New Roman" w:hAnsi="Times New Roman"/>
-          <w:color w:val="000000"/>
-          <w:sz w:val="24"/>
-        </w:rPr>
-        <w:t xml:space="preserve"> </w:t>
-      </w:r>
-      <w:r>
-        <w:rPr>
-          <w:rFonts w:ascii="Times New Roman" w:hAnsi="Times New Roman"/>
-          <w:color w:val="000000"/>
-          <w:sz w:val="24"/>
-        </w:rPr>
-        <w:t>і</w:t>
-      </w:r>
-      <w:r>
-        <w:rPr>
-          <w:rFonts w:ascii="Times New Roman" w:hAnsi="Times New Roman"/>
-          <w:color w:val="000000"/>
-          <w:sz w:val="24"/>
-        </w:rPr>
-        <w:t xml:space="preserve"> </w:t>
-      </w:r>
-      <w:r>
-        <w:rPr>
-          <w:rFonts w:ascii="Times New Roman" w:hAnsi="Times New Roman"/>
-          <w:color w:val="000000"/>
-          <w:sz w:val="24"/>
-        </w:rPr>
-        <w:t>на</w:t>
-      </w:r>
-      <w:r>
-        <w:rPr>
-          <w:rFonts w:ascii="Times New Roman" w:hAnsi="Times New Roman"/>
-          <w:color w:val="000000"/>
-          <w:sz w:val="24"/>
-        </w:rPr>
-        <w:t xml:space="preserve"> </w:t>
-      </w:r>
-      <w:r>
-        <w:rPr>
-          <w:rFonts w:ascii="Times New Roman" w:hAnsi="Times New Roman"/>
-          <w:color w:val="000000"/>
-          <w:sz w:val="24"/>
-        </w:rPr>
-        <w:t>віки</w:t>
-      </w:r>
-      <w:r>
-        <w:rPr>
-          <w:rFonts w:ascii="Times New Roman" w:hAnsi="Times New Roman"/>
-          <w:color w:val="000000"/>
-          <w:sz w:val="24"/>
-        </w:rPr>
-        <w:t xml:space="preserve"> </w:t>
-      </w:r>
-      <w:r>
-        <w:rPr>
-          <w:rFonts w:ascii="Times New Roman" w:hAnsi="Times New Roman"/>
-          <w:color w:val="000000"/>
-          <w:sz w:val="24"/>
-        </w:rPr>
-        <w:t>віків.</w:t>
+          <w:lang w:val="ru-MD"/>
+        </w:rPr>
+        <w:t xml:space="preserve"> Бо Ти святий єси, Боже наш, і в святині перебуваєш, і ми Тобі славу віддаємо: Отцю, і Сину, і Святому Духові, нині і повсякчас, і на віки віків.</w:t>
       </w:r>
     </w:p>
     <w:p>
@@ -20917,20 +21433,21 @@
           <w:color w:val="FF0000"/>
           <w:sz w:val="24"/>
           <w:szCs w:val="24"/>
-          <w:lang w:val="ru-MD"/>
-        </w:rPr>
-      </w:pPr>
-      <w:r>
-        <w:rPr>
-          <w:rFonts w:ascii="Times New Roman" w:hAnsi="Times New Roman" w:cs="Times New Roman"/>
-          <w:i/>
-          <w:color w:val="FF0000"/>
-          <w:sz w:val="24"/>
-          <w:szCs w:val="24"/>
           <w:highlight w:val="yellow"/>
           <w:lang w:val="ru-MD"/>
         </w:rPr>
-        <w:t>ВСТАВИТИ</w:t>
+      </w:pPr>
+      <w:r>
+        <w:rPr>
+          <w:rFonts w:ascii="Times New Roman" w:hAnsi="Times New Roman" w:cs="Times New Roman"/>
+          <w:i/>
+          <w:color w:val="FF0000"/>
+          <w:sz w:val="24"/>
+          <w:szCs w:val="24"/>
+          <w:highlight w:val="yellow"/>
+          <w:lang w:val="ru-MD"/>
+        </w:rPr>
+        <w:t>ВСТАВИТИ СВІТИЛЬНИЙ</w:t>
       </w:r>
     </w:p>
     <w:p>
@@ -24465,13 +24982,23 @@
         </w:rPr>
         <w:t xml:space="preserve"> </w:t>
       </w:r>
-      <w:r>
-        <w:rPr>
-          <w:rFonts w:ascii="Times New Roman" w:hAnsi="Times New Roman" w:cs="Times New Roman"/>
-          <w:sz w:val="24"/>
-          <w:szCs w:val="24"/>
-        </w:rPr>
-        <w:t>Амінь.</w:t>
+      <w:proofErr w:type="spellStart"/>
+      <w:r>
+        <w:rPr>
+          <w:rFonts w:ascii="Times New Roman" w:hAnsi="Times New Roman" w:cs="Times New Roman"/>
+          <w:sz w:val="24"/>
+          <w:szCs w:val="24"/>
+        </w:rPr>
+        <w:t>Амінь</w:t>
+      </w:r>
+      <w:proofErr w:type="spellEnd"/>
+      <w:r>
+        <w:rPr>
+          <w:rFonts w:ascii="Times New Roman" w:hAnsi="Times New Roman" w:cs="Times New Roman"/>
+          <w:sz w:val="24"/>
+          <w:szCs w:val="24"/>
+        </w:rPr>
+        <w:t>.</w:t>
       </w:r>
     </w:p>
     <w:p>

</xml_diff>